<commit_message>
update: cap nhat template hop dong ky moi mat bang moi nhat va push len Vercel
</commit_message>
<xml_diff>
--- a/output_test_26DNa245.docx
+++ b/output_test_26DNa245.docx
@@ -1,6 +1,6 @@
 
 <file path=word/document.xml><?xml version="1.0" encoding="utf-8"?>
-<w:document xmlns:wpc="http://schemas.microsoft.com/office/word/2010/wordprocessingCanvas" xmlns:cx="http://schemas.microsoft.com/office/drawing/2014/chartex" xmlns:cx1="http://schemas.microsoft.com/office/drawing/2015/9/8/chartex" xmlns:cx2="http://schemas.microsoft.com/office/drawing/2015/10/21/chartex" xmlns:cx3="http://schemas.microsoft.com/office/drawing/2016/5/9/chartex" xmlns:cx4="http://schemas.microsoft.com/office/drawing/2016/5/10/chartex" xmlns:cx5="http://schemas.microsoft.com/office/drawing/2016/5/11/chartex" xmlns:cx6="http://schemas.microsoft.com/office/drawing/2016/5/12/chartex" xmlns:cx7="http://schemas.microsoft.com/office/drawing/2016/5/13/chartex" xmlns:cx8="http://schemas.microsoft.com/office/drawing/2016/5/14/chartex" xmlns:mc="http://schemas.openxmlformats.org/markup-compatibility/2006" xmlns:aink="http://schemas.microsoft.com/office/drawing/2016/ink" xmlns:am3d="http://schemas.microsoft.com/office/drawing/2017/model3d" xmlns:o="urn:schemas-microsoft-com:office:office" xmlns:oel="http://schemas.microsoft.com/office/2019/extlst" xmlns:r="http://schemas.openxmlformats.org/officeDocument/2006/relationships" xmlns:m="http://schemas.openxmlformats.org/officeDocument/2006/math" xmlns:v="urn:schemas-microsoft-com:vml" xmlns:wp14="http://schemas.microsoft.com/office/word/2010/wordprocessingDrawing" xmlns:wp="http://schemas.openxmlformats.org/drawingml/2006/wordprocessingDrawing" xmlns:w10="urn:schemas-microsoft-com:office:word" xmlns:w="http://schemas.openxmlformats.org/wordprocessingml/2006/main" xmlns:w14="http://schemas.microsoft.com/office/word/2010/wordml" xmlns:w15="http://schemas.microsoft.com/office/word/2012/wordml" xmlns:w16cex="http://schemas.microsoft.com/office/word/2018/wordml/cex" xmlns:w16cid="http://schemas.microsoft.com/office/word/2016/wordml/cid" xmlns:w16="http://schemas.microsoft.com/office/word/2018/wordml" xmlns:w16du="http://schemas.microsoft.com/office/word/2023/wordml/word16du" xmlns:w16sdtdh="http://schemas.microsoft.com/office/word/2020/wordml/sdtdatahash" xmlns:w16sdtfl="http://schemas.microsoft.com/office/word/2024/wordml/sdtformatlock" xmlns:w16se="http://schemas.microsoft.com/office/word/2015/wordml/symex" xmlns:wpg="http://schemas.microsoft.com/office/word/2010/wordprocessingGroup" xmlns:wpi="http://schemas.microsoft.com/office/word/2010/wordprocessingInk" xmlns:wne="http://schemas.microsoft.com/office/word/2006/wordml" xmlns:wps="http://schemas.microsoft.com/office/word/2010/wordprocessingShape" mc:Ignorable="w14 w15 w16se w16cid w16 w16cex w16sdtdh w16sdtfl w16du wp14">
+<w:document xmlns:wpc="http://schemas.microsoft.com/office/word/2010/wordprocessingCanvas" xmlns:cx="http://schemas.microsoft.com/office/drawing/2014/chartex" xmlns:cx1="http://schemas.microsoft.com/office/drawing/2015/9/8/chartex" xmlns:cx2="http://schemas.microsoft.com/office/drawing/2015/10/21/chartex" xmlns:cx3="http://schemas.microsoft.com/office/drawing/2016/5/9/chartex" xmlns:cx4="http://schemas.microsoft.com/office/drawing/2016/5/10/chartex" xmlns:cx5="http://schemas.microsoft.com/office/drawing/2016/5/11/chartex" xmlns:cx6="http://schemas.microsoft.com/office/drawing/2016/5/12/chartex" xmlns:cx7="http://schemas.microsoft.com/office/drawing/2016/5/13/chartex" xmlns:cx8="http://schemas.microsoft.com/office/drawing/2016/5/14/chartex" xmlns:mc="http://schemas.openxmlformats.org/markup-compatibility/2006" xmlns:aink="http://schemas.microsoft.com/office/drawing/2016/ink" xmlns:am3d="http://schemas.microsoft.com/office/drawing/2017/model3d" xmlns:o="urn:schemas-microsoft-com:office:office" xmlns:r="http://schemas.openxmlformats.org/officeDocument/2006/relationships" xmlns:m="http://schemas.openxmlformats.org/officeDocument/2006/math" xmlns:v="urn:schemas-microsoft-com:vml" xmlns:wp14="http://schemas.microsoft.com/office/word/2010/wordprocessingDrawing" xmlns:wp="http://schemas.openxmlformats.org/drawingml/2006/wordprocessingDrawing" xmlns:w10="urn:schemas-microsoft-com:office:word" xmlns:w="http://schemas.openxmlformats.org/wordprocessingml/2006/main" xmlns:w14="http://schemas.microsoft.com/office/word/2010/wordml" xmlns:w15="http://schemas.microsoft.com/office/word/2012/wordml" xmlns:w16cid="http://schemas.microsoft.com/office/word/2016/wordml/cid" xmlns:w16se="http://schemas.microsoft.com/office/word/2015/wordml/symex" xmlns:wpg="http://schemas.microsoft.com/office/word/2010/wordprocessingGroup" xmlns:wpi="http://schemas.microsoft.com/office/word/2010/wordprocessingInk" xmlns:wne="http://schemas.microsoft.com/office/word/2006/wordml" xmlns:wps="http://schemas.microsoft.com/office/word/2010/wordprocessingShape" mc:Ignorable="w14 w15 w16se w16cid wp14">
   <w:body>
     <w:tbl>
       <w:tblPr>
@@ -179,7 +179,7 @@
                     </wp:anchor>
                   </w:drawing>
                 </mc:Choice>
-                <mc:Fallback xmlns:a14="http://schemas.microsoft.com/office/drawing/2010/main" xmlns:pic="http://schemas.openxmlformats.org/drawingml/2006/picture" xmlns:a="http://schemas.openxmlformats.org/drawingml/2006/main">
+                <mc:Fallback xmlns:oel="http://schemas.microsoft.com/office/2019/extlst" xmlns:w16cex="http://schemas.microsoft.com/office/word/2018/wordml/cex" xmlns:w16="http://schemas.microsoft.com/office/word/2018/wordml" xmlns:w16du="http://schemas.microsoft.com/office/word/2023/wordml/word16du" xmlns:w16sdtdh="http://schemas.microsoft.com/office/word/2020/wordml/sdtdatahash" xmlns:w16sdtfl="http://schemas.microsoft.com/office/word/2024/wordml/sdtformatlock" xmlns:a14="http://schemas.microsoft.com/office/drawing/2010/main" xmlns:a="http://schemas.openxmlformats.org/drawingml/2006/main">
                   <w:pict>
                     <v:line id="Straight Connector 2000649774" style="position:absolute;flip:x;z-index:251661312;visibility:visible;mso-wrap-style:square;mso-wrap-distance-left:9pt;mso-wrap-distance-top:0;mso-wrap-distance-right:9pt;mso-wrap-distance-bottom:0;mso-position-horizontal:absolute;mso-position-horizontal-relative:text;mso-position-vertical:absolute;mso-position-vertical-relative:text" o:spid="_x0000_s1026" strokecolor="black [3213]" strokeweight=".5pt" o:gfxdata="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" from="51.4pt,3.8pt" to="174.3pt,3.8pt" w14:anchorId="3A8FE28D">
                       <v:stroke joinstyle="miter"/>
@@ -271,7 +271,7 @@
                     </wp:anchor>
                   </w:drawing>
                 </mc:Choice>
-                <mc:Fallback xmlns:a14="http://schemas.microsoft.com/office/drawing/2010/main" xmlns:pic="http://schemas.openxmlformats.org/drawingml/2006/picture" xmlns:a="http://schemas.openxmlformats.org/drawingml/2006/main">
+                <mc:Fallback xmlns:oel="http://schemas.microsoft.com/office/2019/extlst" xmlns:w16cex="http://schemas.microsoft.com/office/word/2018/wordml/cex" xmlns:w16="http://schemas.microsoft.com/office/word/2018/wordml" xmlns:w16du="http://schemas.microsoft.com/office/word/2023/wordml/word16du" xmlns:w16sdtdh="http://schemas.microsoft.com/office/word/2020/wordml/sdtdatahash" xmlns:w16sdtfl="http://schemas.microsoft.com/office/word/2024/wordml/sdtformatlock" xmlns:a14="http://schemas.microsoft.com/office/drawing/2010/main" xmlns:a="http://schemas.openxmlformats.org/drawingml/2006/main">
                   <w:pict>
                     <v:line id="Straight Connector 1463436238" style="position:absolute;flip:y;z-index:251660288;visibility:visible;mso-wrap-style:square;mso-width-percent:0;mso-height-percent:0;mso-wrap-distance-left:9pt;mso-wrap-distance-top:0;mso-wrap-distance-right:9pt;mso-wrap-distance-bottom:0;mso-position-horizontal:absolute;mso-position-horizontal-relative:text;mso-position-vertical:absolute;mso-position-vertical-relative:text;mso-width-percent:0;mso-height-percent:0;mso-width-relative:margin;mso-height-relative:margin" o:spid="_x0000_s1026" strokecolor="black [3213]" strokeweight=".5pt" o:gfxdata="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" from="66.8pt,5.25pt" to="223.7pt,5.25pt" w14:anchorId="7B0B0E0A">
                       <v:stroke joinstyle="miter"/>
@@ -305,7 +305,7 @@
                 <w:rFonts w:ascii="Times New Roman" w:hAnsi="Times New Roman"/>
                 <w:szCs w:val="26"/>
               </w:rPr>
-              <w:t>Số: /TTr-VT</w:t>
+              <w:t>Số:       /TTr-VT</w:t>
             </w:r>
           </w:p>
         </w:tc>
@@ -329,7 +329,41 @@
                 <w:i/>
                 <w:szCs w:val="28"/>
               </w:rPr>
-              <w:t>Đồng Nai, ngày      tháng      năm  2026</w:t>
+              <w:t xml:space="preserve">Đồng Nai, ngày </w:t>
+            </w:r>
+            <w:r>
+              <w:rPr>
+                <w:rFonts w:ascii="Times New Roman" w:hAnsi="Times New Roman"/>
+                <w:i/>
+                <w:szCs w:val="28"/>
+                <w:lang w:val="vi-VN"/>
+              </w:rPr>
+              <w:t xml:space="preserve"> </w:t>
+            </w:r>
+            <w:r>
+              <w:rPr>
+                <w:rFonts w:ascii="Times New Roman" w:hAnsi="Times New Roman"/>
+                <w:i/>
+                <w:szCs w:val="28"/>
+              </w:rPr>
+              <w:t xml:space="preserve"> tháng</w:t>
+            </w:r>
+            <w:r>
+              <w:rPr>
+                <w:rFonts w:ascii="Times New Roman" w:hAnsi="Times New Roman"/>
+                <w:i/>
+                <w:szCs w:val="28"/>
+                <w:lang w:val="vi-VN"/>
+              </w:rPr>
+              <w:t xml:space="preserve"> </w:t>
+            </w:r>
+            <w:r>
+              <w:rPr>
+                <w:rFonts w:ascii="Times New Roman" w:hAnsi="Times New Roman"/>
+                <w:i/>
+                <w:szCs w:val="28"/>
+              </w:rPr>
+              <w:t xml:space="preserve">  năm 2026</w:t>
             </w:r>
           </w:p>
         </w:tc>
@@ -414,95 +448,32 @@
         <w:rPr>
           <w:rFonts w:ascii="Times New Roman" w:hAnsi="Times New Roman"/>
         </w:rPr>
-        <w:t xml:space="preserve"> thanh lý và ký lại hợp đồng</w:t>
+        <w:t xml:space="preserve"> </w:t>
+      </w:r>
+      <w:r>
+        <w:rPr>
+          <w:rFonts w:ascii="Times New Roman" w:hAnsi="Times New Roman"/>
+        </w:rPr>
+        <w:t>ký</w:t>
+      </w:r>
+      <w:r>
+        <w:rPr>
+          <w:rFonts w:ascii="Times New Roman" w:hAnsi="Times New Roman"/>
+        </w:rPr>
+        <w:t xml:space="preserve"> hợp đồng</w:t>
+      </w:r>
+      <w:r>
+        <w:rPr>
+          <w:rFonts w:ascii="Times New Roman" w:hAnsi="Times New Roman"/>
+          <w:lang w:val="vi-VN"/>
+        </w:rPr>
+        <w:t xml:space="preserve"> thuê mặt bằng trạm</w:t>
       </w:r>
       <w:r>
         <w:rPr>
           <w:rFonts w:ascii="Times New Roman" w:hAnsi="Times New Roman"/>
         </w:rPr>
         <w:t xml:space="preserve"> 26DNa245</w:t>
-      </w:r>
-    </w:p>
-    <w:p>
-      <w:pPr>
-        <w:spacing w:before="120" w:line="360" w:lineRule="exact"/>
-        <w:jc w:val="center"/>
-        <w:rPr>
-          <w:rFonts w:ascii="Times New Roman" w:hAnsi="Times New Roman"/>
-        </w:rPr>
-      </w:pPr>
-      <w:r>
-        <w:rPr>
-          <w:rFonts w:ascii="Times New Roman" w:hAnsi="Times New Roman"/>
-          <w:b/>
-          <w:bCs/>
-          <w:noProof/>
-          <w:szCs w:val="25"/>
-        </w:rPr>
-        <w:drawing>
-          <wp:anchor distT="0" distB="0" distL="114300" distR="114300" simplePos="0" relativeHeight="251659264" behindDoc="1" locked="0" layoutInCell="1" allowOverlap="1" wp14:anchorId="0A443629" wp14:editId="75DE6EE0">
-            <wp:simplePos x="0" y="0"/>
-            <wp:positionH relativeFrom="margin">
-              <wp:align>center</wp:align>
-            </wp:positionH>
-            <wp:positionV relativeFrom="paragraph">
-              <wp:posOffset>97790</wp:posOffset>
-            </wp:positionV>
-            <wp:extent cx="2108200" cy="19050"/>
-            <wp:effectExtent l="0" t="0" r="6350" b="0"/>
-            <wp:wrapTight wrapText="bothSides">
-              <wp:wrapPolygon edited="0">
-                <wp:start x="0" y="0"/>
-                <wp:lineTo x="0" y="0"/>
-                <wp:lineTo x="21470" y="0"/>
-                <wp:lineTo x="21470" y="0"/>
-                <wp:lineTo x="0" y="0"/>
-              </wp:wrapPolygon>
-            </wp:wrapTight>
-            <wp:docPr id="384057371" name="Picture 1"/>
-            <wp:cNvGraphicFramePr>
-              <a:graphicFrameLocks xmlns:a="http://schemas.openxmlformats.org/drawingml/2006/main" noChangeAspect="1"/>
-            </wp:cNvGraphicFramePr>
-            <a:graphic xmlns:a="http://schemas.openxmlformats.org/drawingml/2006/main">
-              <a:graphicData uri="http://schemas.openxmlformats.org/drawingml/2006/picture">
-                <pic:pic xmlns:pic="http://schemas.openxmlformats.org/drawingml/2006/picture">
-                  <pic:nvPicPr>
-                    <pic:cNvPr id="0" name="Picture 2"/>
-                    <pic:cNvPicPr>
-                      <a:picLocks noChangeAspect="1" noChangeArrowheads="1"/>
-                    </pic:cNvPicPr>
-                  </pic:nvPicPr>
-                  <pic:blipFill>
-                    <a:blip r:embed="rId5">
-                      <a:extLst>
-                        <a:ext uri="{28A0092B-C50C-407E-A947-70E740481C1C}">
-                          <a14:useLocalDpi xmlns:a14="http://schemas.microsoft.com/office/drawing/2010/main" val="0"/>
-                        </a:ext>
-                      </a:extLst>
-                    </a:blip>
-                    <a:srcRect/>
-                    <a:stretch>
-                      <a:fillRect/>
-                    </a:stretch>
-                  </pic:blipFill>
-                  <pic:spPr bwMode="auto">
-                    <a:xfrm>
-                      <a:off x="0" y="0"/>
-                      <a:ext cx="2108200" cy="19050"/>
-                    </a:xfrm>
-                    <a:prstGeom prst="rect">
-                      <a:avLst/>
-                    </a:prstGeom>
-                    <a:noFill/>
-                    <a:ln>
-                      <a:noFill/>
-                    </a:ln>
-                  </pic:spPr>
-                </pic:pic>
-              </a:graphicData>
-            </a:graphic>
-          </wp:anchor>
-        </w:drawing>
       </w:r>
     </w:p>
     <w:p>
@@ -546,13 +517,15 @@
         <w:pBdr>
           <w:top w:val="single" w:sz="4" w:space="1" w:color="auto"/>
           <w:left w:val="single" w:sz="4" w:space="4" w:color="auto"/>
-          <w:bottom w:val="single" w:sz="4" w:space="0" w:color="auto"/>
+          <w:bottom w:val="single" w:sz="4" w:space="31" w:color="auto"/>
           <w:right w:val="single" w:sz="4" w:space="0" w:color="auto"/>
         </w:pBdr>
         <w:spacing w:before="120" w:line="360" w:lineRule="exact"/>
         <w:jc w:val="center"/>
         <w:rPr>
           <w:rFonts w:ascii="Times New Roman" w:hAnsi="Times New Roman"/>
+          <w:b/>
+          <w:szCs w:val="26"/>
         </w:rPr>
       </w:pPr>
       <w:r>
@@ -569,7 +542,7 @@
         <w:pBdr>
           <w:top w:val="single" w:sz="4" w:space="1" w:color="auto"/>
           <w:left w:val="single" w:sz="4" w:space="4" w:color="auto"/>
-          <w:bottom w:val="single" w:sz="4" w:space="0" w:color="auto"/>
+          <w:bottom w:val="single" w:sz="4" w:space="31" w:color="auto"/>
           <w:right w:val="single" w:sz="4" w:space="0" w:color="auto"/>
         </w:pBdr>
         <w:spacing w:before="120" w:line="360" w:lineRule="exact"/>
@@ -578,19 +551,13 @@
           <w:rFonts w:ascii="Times New Roman" w:hAnsi="Times New Roman"/>
         </w:rPr>
       </w:pPr>
-      <w:r>
-        <w:rPr>
-          <w:rFonts w:ascii="Times New Roman" w:hAnsi="Times New Roman"/>
-        </w:rPr>
-        <w:t> </w:t>
-      </w:r>
     </w:p>
     <w:p>
       <w:pPr>
         <w:pBdr>
           <w:top w:val="single" w:sz="4" w:space="1" w:color="auto"/>
           <w:left w:val="single" w:sz="4" w:space="4" w:color="auto"/>
-          <w:bottom w:val="single" w:sz="4" w:space="0" w:color="auto"/>
+          <w:bottom w:val="single" w:sz="4" w:space="31" w:color="auto"/>
           <w:right w:val="single" w:sz="4" w:space="0" w:color="auto"/>
         </w:pBdr>
         <w:spacing w:before="120" w:line="360" w:lineRule="exact"/>
@@ -599,21 +566,13 @@
           <w:rFonts w:ascii="Times New Roman" w:hAnsi="Times New Roman"/>
         </w:rPr>
       </w:pPr>
-      <w:r>
-        <w:rPr>
-          <w:rFonts w:ascii="Times New Roman" w:hAnsi="Times New Roman"/>
-          <w:szCs w:val="28"/>
-          <w:lang w:val="sv-SE"/>
-        </w:rPr>
-        <w:t> </w:t>
-      </w:r>
     </w:p>
     <w:p>
       <w:pPr>
         <w:pBdr>
           <w:top w:val="single" w:sz="4" w:space="1" w:color="auto"/>
           <w:left w:val="single" w:sz="4" w:space="4" w:color="auto"/>
-          <w:bottom w:val="single" w:sz="4" w:space="0" w:color="auto"/>
+          <w:bottom w:val="single" w:sz="4" w:space="31" w:color="auto"/>
           <w:right w:val="single" w:sz="4" w:space="0" w:color="auto"/>
         </w:pBdr>
         <w:spacing w:before="120" w:line="360" w:lineRule="exact"/>
@@ -622,12 +581,6 @@
           <w:rFonts w:ascii="Times New Roman" w:hAnsi="Times New Roman"/>
         </w:rPr>
       </w:pPr>
-      <w:r>
-        <w:rPr>
-          <w:rFonts w:ascii="Times New Roman" w:hAnsi="Times New Roman"/>
-        </w:rPr>
-        <w:t> </w:t>
-      </w:r>
     </w:p>
     <w:p>
       <w:pPr>
@@ -910,6 +863,15 @@
         </w:rPr>
         <w:t xml:space="preserve">thửa đất số 247, tờ bản đồ số 113, xã Phú Vinh, huyện Định Quán</w:t>
       </w:r>
+      <w:proofErr w:type="gramStart"/>
+      <w:r>
+        <w:rPr>
+          <w:rFonts w:ascii="Times New Roman" w:hAnsi="Times New Roman"/>
+          <w:szCs w:val="28"/>
+          <w:lang w:val="da-DK"/>
+        </w:rPr>
+        <w:t/>
+      </w:r>
       <w:r>
         <w:rPr>
           <w:rStyle w:val="Emphasis"/>
@@ -920,6 +882,18 @@
           <w:lang w:val="da-DK"/>
         </w:rPr>
         <w:t xml:space="preserve"> (Xã Phú Vinh, Đồng Nai)</w:t>
+      </w:r>
+      <w:proofErr w:type="gramEnd"/>
+      <w:r>
+        <w:rPr>
+          <w:rStyle w:val="Emphasis"/>
+          <w:rFonts w:ascii="Times New Roman" w:hAnsi="Times New Roman"/>
+          <w:i w:val="0"/>
+          <w:iCs w:val="0"/>
+          <w:szCs w:val="28"/>
+          <w:lang w:val="da-DK"/>
+        </w:rPr>
+        <w:t/>
       </w:r>
     </w:p>
     <w:p>
@@ -1350,6 +1324,7 @@
           <w:szCs w:val="26"/>
           <w:lang w:val="vi-VN"/>
         </w:rPr>
+        <w:lastRenderedPageBreak/>
         <w:t xml:space="preserve"> </w:t>
       </w:r>
       <w:r>
@@ -1378,7 +1353,6 @@
         <w:rPr>
           <w:rFonts w:ascii="Times New Roman" w:hAnsi="Times New Roman"/>
         </w:rPr>
-        <w:lastRenderedPageBreak/>
         <w:t>Thời hạn hợp đồng:</w:t>
       </w:r>
       <w:r>
@@ -2284,6 +2258,7 @@
         </w:rPr>
         <w:t xml:space="preserve"> </w:t>
       </w:r>
+      <w:proofErr w:type="gramStart"/>
       <w:r>
         <w:rPr>
           <w:rFonts w:ascii="Times New Roman" w:hAnsi="Times New Roman"/>
@@ -2304,7 +2279,15 @@
           <w:rFonts w:ascii="Times New Roman" w:hAnsi="Times New Roman"/>
           <w:szCs w:val="26"/>
         </w:rPr>
-        <w:t>31/12 của</w:t>
+        <w:t>31</w:t>
+      </w:r>
+      <w:proofErr w:type="gramEnd"/>
+      <w:r>
+        <w:rPr>
+          <w:rFonts w:ascii="Times New Roman" w:hAnsi="Times New Roman"/>
+          <w:szCs w:val="26"/>
+        </w:rPr>
+        <w:t>/12 của</w:t>
       </w:r>
       <w:r>
         <w:rPr>
@@ -2559,7 +2542,33 @@
           <w:sz w:val="26"/>
           <w:szCs w:val="26"/>
         </w:rPr>
-        <w:t>Kể từ thời điểm MobiFone hoàn thành lắp đặt, phát sóng trạm ( thể hiện bằng biên bản phát sóng) nhưng không quá 60 ngày kể từ ngày hoàn thành lắp dựng xong cột anten.</w:t>
+        <w:t xml:space="preserve">Kể từ thời điểm MobiFone hoàn thành lắp đặt, phát sóng trạm </w:t>
+      </w:r>
+      <w:proofErr w:type="gramStart"/>
+      <w:r>
+        <w:rPr>
+          <w:rFonts w:ascii="Times New Roman" w:hAnsi="Times New Roman"/>
+          <w:bCs/>
+          <w:iCs/>
+          <w:color w:val="000000" w:themeColor="text1"/>
+          <w:spacing w:val="-2"/>
+          <w:sz w:val="26"/>
+          <w:szCs w:val="26"/>
+        </w:rPr>
+        <w:t>( thể</w:t>
+      </w:r>
+      <w:proofErr w:type="gramEnd"/>
+      <w:r>
+        <w:rPr>
+          <w:rFonts w:ascii="Times New Roman" w:hAnsi="Times New Roman"/>
+          <w:bCs/>
+          <w:iCs/>
+          <w:color w:val="000000" w:themeColor="text1"/>
+          <w:spacing w:val="-2"/>
+          <w:sz w:val="26"/>
+          <w:szCs w:val="26"/>
+        </w:rPr>
+        <w:t xml:space="preserve"> hiện bằng biên bản phát sóng) nhưng không quá 60 ngày kể từ ngày hoàn thành lắp dựng xong cột anten.</w:t>
       </w:r>
     </w:p>
     <w:p>
@@ -2986,6 +2995,8 @@
       <w:r>
         <w:br w:type="page"/>
       </w:r>
+      <w:bookmarkStart w:id="0" w:name="_GoBack"/>
+      <w:bookmarkEnd w:id="0"/>
     </w:p>
     <w:tbl>
       <w:tblPr>
@@ -3159,7 +3170,7 @@
                     </wp:anchor>
                   </w:drawing>
                 </mc:Choice>
-                <mc:Fallback xmlns:a14="http://schemas.microsoft.com/office/drawing/2010/main" xmlns:pic="http://schemas.openxmlformats.org/drawingml/2006/picture" xmlns:a="http://schemas.openxmlformats.org/drawingml/2006/main">
+                <mc:Fallback xmlns:oel="http://schemas.microsoft.com/office/2019/extlst" xmlns:w16cex="http://schemas.microsoft.com/office/word/2018/wordml/cex" xmlns:w16="http://schemas.microsoft.com/office/word/2018/wordml" xmlns:w16du="http://schemas.microsoft.com/office/word/2023/wordml/word16du" xmlns:w16sdtdh="http://schemas.microsoft.com/office/word/2020/wordml/sdtdatahash" xmlns:w16sdtfl="http://schemas.microsoft.com/office/word/2024/wordml/sdtformatlock" xmlns:a14="http://schemas.microsoft.com/office/drawing/2010/main" xmlns:a="http://schemas.openxmlformats.org/drawingml/2006/main">
                   <w:pict>
                     <v:shape id="Straight Arrow Connector 4" style="position:absolute;margin-left:61.15pt;margin-top:19.7pt;width:132pt;height:0;z-index:251664384;visibility:visible;mso-wrap-style:square;mso-width-percent:0;mso-height-percent:0;mso-wrap-distance-left:9pt;mso-wrap-distance-top:-6e-5mm;mso-wrap-distance-right:9pt;mso-wrap-distance-bottom:-6e-5mm;mso-position-horizontal:absolute;mso-position-horizontal-relative:text;mso-position-vertical:absolute;mso-position-vertical-relative:text;mso-width-percent:0;mso-height-percent:0;mso-width-relative:page;mso-height-relative:page" o:spid="_x0000_s1026" type="#_x0000_t32" o:gfxdata="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" w14:anchorId="18EC2693"/>
                   </w:pict>
@@ -3264,7 +3275,7 @@
                     </wp:anchor>
                   </w:drawing>
                 </mc:Choice>
-                <mc:Fallback xmlns:a14="http://schemas.microsoft.com/office/drawing/2010/main" xmlns:pic="http://schemas.openxmlformats.org/drawingml/2006/picture" xmlns:a="http://schemas.openxmlformats.org/drawingml/2006/main">
+                <mc:Fallback xmlns:oel="http://schemas.microsoft.com/office/2019/extlst" xmlns:w16cex="http://schemas.microsoft.com/office/word/2018/wordml/cex" xmlns:w16="http://schemas.microsoft.com/office/word/2018/wordml" xmlns:w16du="http://schemas.microsoft.com/office/word/2023/wordml/word16du" xmlns:w16sdtdh="http://schemas.microsoft.com/office/word/2020/wordml/sdtdatahash" xmlns:w16sdtfl="http://schemas.microsoft.com/office/word/2024/wordml/sdtformatlock" xmlns:a14="http://schemas.microsoft.com/office/drawing/2010/main" xmlns:a="http://schemas.openxmlformats.org/drawingml/2006/main">
                   <w:pict>
                     <v:shape id="Straight Arrow Connector 5" style="position:absolute;margin-left:60.2pt;margin-top:4.05pt;width:124.8pt;height:0;z-index:251663360;visibility:visible;mso-wrap-style:square;mso-width-percent:0;mso-height-percent:0;mso-wrap-distance-left:9pt;mso-wrap-distance-top:-6e-5mm;mso-wrap-distance-right:9pt;mso-wrap-distance-bottom:-6e-5mm;mso-position-horizontal:absolute;mso-position-horizontal-relative:text;mso-position-vertical:absolute;mso-position-vertical-relative:text;mso-width-percent:0;mso-height-percent:0;mso-width-relative:page;mso-height-relative:page" o:spid="_x0000_s1026" type="#_x0000_t32" o:gfxdata="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" w14:anchorId="0680D1E1"/>
                   </w:pict>
@@ -3324,7 +3335,7 @@
           <w:color w:val="auto"/>
           <w:sz w:val="26"/>
         </w:rPr>
-        <w:t>ĐẶT T</w:t>
+        <w:t>ĐẶT</w:t>
       </w:r>
       <w:r>
         <w:rPr>
@@ -3334,7 +3345,7 @@
           <w:color w:val="auto"/>
           <w:sz w:val="26"/>
         </w:rPr>
-        <w:t>RẠM THU PHÁT SÓNG VIỄN THÔNG (BTS)</w:t>
+        <w:t xml:space="preserve"> TRẠM THU PHÁT SÓNG VIỄN THÔNG (BTS)</w:t>
       </w:r>
     </w:p>
     <w:p>
@@ -3389,7 +3400,7 @@
           <w:tab w:val="left" w:pos="1440"/>
         </w:tabs>
         <w:spacing w:before="120" w:after="120"/>
-        <w:ind w:left="1440" w:firstLine="709"/>
+        <w:ind w:left="1440"/>
         <w:rPr>
           <w:rFonts w:ascii="Times New Roman" w:hAnsi="Times New Roman"/>
           <w:b/>
@@ -3402,20 +3413,7 @@
           <w:b/>
           <w:bCs/>
         </w:rPr>
-        <w:t xml:space="preserve">Địa chỉ trạm: thửa đất số 247, tờ bản đồ số 113, xã Phú Vinh, huyện Định Quán</w:t>
-      </w:r>
-      <w:r>
-        <w:rPr>
-          <w:rStyle w:val="Emphasis"/>
-          <w:rFonts w:ascii="Times New Roman" w:hAnsi="Times New Roman"/>
-          <w:b/>
-          <w:bCs/>
-          <w:i w:val="0"/>
-          <w:iCs w:val="0"/>
-          <w:szCs w:val="28"/>
-          <w:lang w:val="da-DK"/>
-        </w:rPr>
-        <w:t xml:space="preserve"> (Xã Phú Vinh, Đồng Nai)</w:t>
+        <w:t xml:space="preserve">Địa chỉ trạm: thửa đất số 247, tờ bản đồ số 113, xã Phú Vinh, huyện Định Quán ( (Xã Phú Vinh, Đồng Nai))</w:t>
       </w:r>
       <w:r>
         <w:rPr>
@@ -3433,7 +3431,7 @@
           <w:tab w:val="left" w:pos="1440"/>
         </w:tabs>
         <w:spacing w:before="120" w:after="120"/>
-        <w:ind w:left="1440" w:firstLine="709"/>
+        <w:ind w:left="1440"/>
         <w:rPr>
           <w:rFonts w:ascii="Times New Roman" w:hAnsi="Times New Roman"/>
           <w:b/>
@@ -3467,7 +3465,7 @@
           <w:lang w:val="vi-VN"/>
         </w:rPr>
       </w:pPr>
-      <w:bookmarkStart w:id="0" w:name="_Hlk76390970"/>
+      <w:bookmarkStart w:id="1" w:name="_Hlk76390970"/>
       <w:r>
         <w:rPr>
           <w:rFonts w:ascii="Times New Roman" w:hAnsi="Times New Roman"/>
@@ -3476,9 +3474,29 @@
           <w:szCs w:val="28"/>
           <w:lang w:val="vi-VN"/>
         </w:rPr>
-        <w:t>Số: -26/</w:t>
-      </w:r>
-      <w:bookmarkEnd w:id="0"/>
+        <w:t xml:space="preserve">Số: </w:t>
+      </w:r>
+      <w:r>
+        <w:rPr>
+          <w:rFonts w:ascii="Times New Roman" w:hAnsi="Times New Roman"/>
+          <w:b/>
+          <w:bCs/>
+          <w:szCs w:val="28"/>
+          <w:lang w:val="vi-VN"/>
+        </w:rPr>
+        <w:t xml:space="preserve">    </w:t>
+      </w:r>
+      <w:r>
+        <w:rPr>
+          <w:rFonts w:ascii="Times New Roman" w:hAnsi="Times New Roman"/>
+          <w:b/>
+          <w:bCs/>
+          <w:szCs w:val="28"/>
+          <w:lang w:val="vi-VN"/>
+        </w:rPr>
+        <w:t xml:space="preserve">   -26/</w:t>
+      </w:r>
+      <w:bookmarkEnd w:id="1"/>
       <w:r>
         <w:rPr>
           <w:rFonts w:ascii="Times New Roman" w:eastAsiaTheme="minorEastAsia" w:hAnsi="Times New Roman"/>
@@ -3623,7 +3641,7 @@
           <w:szCs w:val="26"/>
           <w:lang w:val="vi-VN"/>
         </w:rPr>
-        <w:t xml:space="preserve">Hôm nay, ngày      tháng      năm </w:t>
+        <w:t>Hôm nay, ngày        tháng         năm</w:t>
       </w:r>
       <w:r>
         <w:rPr>
@@ -3680,7 +3698,7 @@
       <w:pPr>
         <w:widowControl w:val="0"/>
         <w:spacing w:before="60" w:after="60"/>
-        <w:ind w:left="-18" w:firstLine="709"/>
+        <w:ind w:left="-18"/>
         <w:jc w:val="both"/>
         <w:rPr>
           <w:rFonts w:ascii="Times New Roman" w:hAnsi="Times New Roman"/>
@@ -3707,7 +3725,6 @@
       <w:pPr>
         <w:widowControl w:val="0"/>
         <w:shd w:val="clear" w:color="auto" w:fill="FFFFFF"/>
-        <w:ind w:firstLine="709"/>
         <w:rPr>
           <w:rFonts w:ascii="Times New Roman" w:hAnsi="Times New Roman"/>
           <w:szCs w:val="26"/>
@@ -3832,13 +3849,22 @@
         </w:rPr>
         <w:t xml:space="preserve">Địa chỉ trạm </w:t>
       </w:r>
+      <w:proofErr w:type="gramStart"/>
       <w:r>
         <w:rPr>
           <w:rFonts w:ascii="Times New Roman" w:hAnsi="Times New Roman"/>
           <w:szCs w:val="26"/>
         </w:rPr>
         <w:tab/>
-        <w:t xml:space="preserve">:thửa đất số 247, tờ bản đồ số 113, xã Phú Vinh, huyện Định Quán ( (Xã Phú Vinh, Đồng Nai))</w:t>
+        <w:t xml:space="preserve">:thửa đất số 247, tờ bản đồ số 113, xã Phú Vinh, huyện Định Quán</w:t>
+      </w:r>
+      <w:proofErr w:type="gramEnd"/>
+      <w:r>
+        <w:rPr>
+          <w:rFonts w:ascii="Times New Roman" w:hAnsi="Times New Roman"/>
+          <w:szCs w:val="26"/>
+        </w:rPr>
+        <w:t xml:space="preserve"> ( (Xã Phú Vinh, Đồng Nai))</w:t>
       </w:r>
     </w:p>
     <w:p>
@@ -3896,7 +3922,7 @@
           <w:rFonts w:ascii="Times New Roman" w:hAnsi="Times New Roman"/>
           <w:szCs w:val="26"/>
         </w:rPr>
-        <w:t xml:space="preserve">Điện thọai </w:t>
+        <w:t xml:space="preserve">Điện thoại </w:t>
       </w:r>
       <w:r>
         <w:rPr>
@@ -4378,7 +4404,6 @@
       <w:pPr>
         <w:widowControl w:val="0"/>
         <w:spacing w:before="80" w:after="80" w:line="360" w:lineRule="atLeast"/>
-        <w:ind w:firstLine="709"/>
         <w:jc w:val="both"/>
         <w:rPr>
           <w:rFonts w:ascii="Times New Roman" w:hAnsi="Times New Roman"/>
@@ -4394,7 +4419,61 @@
           <w:szCs w:val="26"/>
           <w:lang w:val="fr-FR"/>
         </w:rPr>
-        <w:t>(Giấy UQ số 21/UQ-MBF.ĐNa ngày 19/06/2026 do Giám đốc MobiFone Đồng Nai – Chi nhánh Tổng Công ty Viễn Thông MobiFone, Ông Bùi Chí Tuệ ký)</w:t>
+        <w:t xml:space="preserve">(Giấy UQ số </w:t>
+      </w:r>
+      <w:r>
+        <w:rPr>
+          <w:rFonts w:ascii="Times New Roman" w:hAnsi="Times New Roman"/>
+          <w:i/>
+          <w:szCs w:val="26"/>
+          <w:lang w:val="vi-VN"/>
+        </w:rPr>
+        <w:t>21</w:t>
+      </w:r>
+      <w:r>
+        <w:rPr>
+          <w:rFonts w:ascii="Times New Roman" w:hAnsi="Times New Roman"/>
+          <w:i/>
+          <w:szCs w:val="26"/>
+          <w:lang w:val="fr-FR"/>
+        </w:rPr>
+        <w:t xml:space="preserve">/UQ-MBF.ĐNa ngày </w:t>
+      </w:r>
+      <w:r>
+        <w:rPr>
+          <w:rFonts w:ascii="Times New Roman" w:hAnsi="Times New Roman"/>
+          <w:i/>
+          <w:szCs w:val="26"/>
+          <w:lang w:val="vi-VN"/>
+        </w:rPr>
+        <w:t>19</w:t>
+      </w:r>
+      <w:r>
+        <w:rPr>
+          <w:rFonts w:ascii="Times New Roman" w:hAnsi="Times New Roman"/>
+          <w:i/>
+          <w:szCs w:val="26"/>
+          <w:lang w:val="fr-FR"/>
+        </w:rPr>
+        <w:t>/0</w:t>
+      </w:r>
+      <w:r>
+        <w:rPr>
+          <w:rFonts w:ascii="Times New Roman" w:hAnsi="Times New Roman"/>
+          <w:i/>
+          <w:szCs w:val="26"/>
+          <w:lang w:val="vi-VN"/>
+        </w:rPr>
+        <w:t>6</w:t>
+      </w:r>
+      <w:r>
+        <w:rPr>
+          <w:rFonts w:ascii="Times New Roman" w:hAnsi="Times New Roman"/>
+          <w:i/>
+          <w:szCs w:val="26"/>
+          <w:lang w:val="fr-FR"/>
+        </w:rPr>
+        <w:t>/2026 do Giám đốc MobiFone Đồng Nai – Chi nhánh Tổng Công ty Viễn Thông MobiFone, Ông Bùi Chí Tuệ ký)</w:t>
       </w:r>
     </w:p>
     <w:p>
@@ -4609,12 +4688,19 @@
         </w:rPr>
         <w:t xml:space="preserve"> </w:t>
       </w:r>
+      <w:r>
+        <w:rPr>
+          <w:rFonts w:ascii="Times New Roman" w:hAnsi="Times New Roman"/>
+          <w:szCs w:val="26"/>
+          <w:lang w:val="da-DK"/>
+        </w:rPr>
+        <w:t xml:space="preserve"> </w:t>
+      </w:r>
     </w:p>
     <w:p>
       <w:pPr>
         <w:widowControl w:val="0"/>
         <w:spacing w:before="120" w:after="120"/>
-        <w:ind w:firstLine="709"/>
         <w:jc w:val="both"/>
         <w:rPr>
           <w:rFonts w:ascii="Times New Roman" w:hAnsi="Times New Roman"/>
@@ -4960,7 +5046,7 @@
         <w:autoSpaceDE w:val="0"/>
         <w:autoSpaceDN w:val="0"/>
         <w:spacing w:before="60" w:after="60"/>
-        <w:ind w:left="720" w:firstLine="709"/>
+        <w:ind w:left="720"/>
         <w:jc w:val="both"/>
         <w:rPr>
           <w:rFonts w:ascii="Times New Roman" w:hAnsi="Times New Roman"/>
@@ -5074,7 +5160,7 @@
           <w:szCs w:val="26"/>
           <w:lang w:val="da-DK"/>
         </w:rPr>
-        <w:t>, cở sở hạ tầng trạm BTS</w:t>
+        <w:t>, cơ sở hạ tầng trạm BTS</w:t>
       </w:r>
       <w:r>
         <w:rPr>
@@ -5367,7 +5453,7 @@
       <w:pPr>
         <w:pStyle w:val="NormalWeb"/>
         <w:spacing w:before="60" w:beforeAutospacing="0" w:after="60" w:afterAutospacing="0"/>
-        <w:ind w:left="567" w:firstLine="709"/>
+        <w:ind w:left="567"/>
         <w:jc w:val="both"/>
         <w:rPr>
           <w:b/>
@@ -5381,14 +5467,14 @@
           <w:sz w:val="26"/>
           <w:szCs w:val="26"/>
         </w:rPr>
-        <w:t xml:space="preserve"> 1. Thời hạn thuê: Từ ngày ................ đến ngày </w:t>
+        <w:t xml:space="preserve"> 1. Thời hạn thuê: </w:t>
       </w:r>
       <w:r>
         <w:rPr>
           <w:sz w:val="26"/>
           <w:szCs w:val="26"/>
         </w:rPr>
-        <w:t xml:space="preserve">................</w:t>
+        <w:t>10 năm</w:t>
       </w:r>
     </w:p>
     <w:p>
@@ -5585,7 +5671,6 @@
     </w:p>
     <w:p>
       <w:pPr>
-        <w:ind w:firstLine="709"/>
         <w:rPr>
           <w:rFonts w:ascii="Times New Roman" w:hAnsi="Times New Roman"/>
           <w:szCs w:val="26"/>
@@ -5601,9 +5686,276 @@
     </w:p>
     <w:p>
       <w:pPr>
+        <w:pStyle w:val="BodyTextIndent3"/>
+        <w:numPr>
+          <w:ilvl w:val="0"/>
+          <w:numId w:val="29"/>
+        </w:numPr>
+        <w:tabs>
+          <w:tab w:val="clear" w:pos="180"/>
+        </w:tabs>
+        <w:suppressAutoHyphens/>
+        <w:autoSpaceDE/>
+        <w:autoSpaceDN/>
+        <w:ind w:left="0" w:firstLine="567"/>
+        <w:rPr>
+          <w:rFonts w:ascii="Times New Roman" w:hAnsi="Times New Roman"/>
+          <w:bCs/>
+          <w:iCs/>
+          <w:color w:val="000000" w:themeColor="text1"/>
+          <w:spacing w:val="-2"/>
+          <w:sz w:val="26"/>
+          <w:szCs w:val="26"/>
+          <w:lang w:val="vi-VN"/>
+        </w:rPr>
+      </w:pPr>
+      <w:r>
+        <w:rPr>
+          <w:rFonts w:ascii="Times New Roman" w:hAnsi="Times New Roman"/>
+          <w:szCs w:val="26"/>
+        </w:rPr>
+        <w:t xml:space="preserve">- Thời điểm bắt đầu tính tiền thuê: </w:t>
+      </w:r>
+      <w:r>
+        <w:rPr>
+          <w:rFonts w:ascii="Times New Roman" w:hAnsi="Times New Roman"/>
+          <w:bCs/>
+          <w:iCs/>
+          <w:color w:val="000000" w:themeColor="text1"/>
+          <w:spacing w:val="-2"/>
+          <w:sz w:val="26"/>
+          <w:szCs w:val="26"/>
+        </w:rPr>
+        <w:t xml:space="preserve">Kể từ thời điểm MobiFone hoàn thành lắp đặt, phát sóng trạm </w:t>
+      </w:r>
+      <w:proofErr w:type="gramStart"/>
+      <w:r>
+        <w:rPr>
+          <w:rFonts w:ascii="Times New Roman" w:hAnsi="Times New Roman"/>
+          <w:bCs/>
+          <w:iCs/>
+          <w:color w:val="000000" w:themeColor="text1"/>
+          <w:spacing w:val="-2"/>
+          <w:sz w:val="26"/>
+          <w:szCs w:val="26"/>
+        </w:rPr>
+        <w:t>( thể</w:t>
+      </w:r>
+      <w:proofErr w:type="gramEnd"/>
+      <w:r>
+        <w:rPr>
+          <w:rFonts w:ascii="Times New Roman" w:hAnsi="Times New Roman"/>
+          <w:bCs/>
+          <w:iCs/>
+          <w:color w:val="000000" w:themeColor="text1"/>
+          <w:spacing w:val="-2"/>
+          <w:sz w:val="26"/>
+          <w:szCs w:val="26"/>
+        </w:rPr>
+        <w:t xml:space="preserve"> hiện bằng biên bản phát sóng) nhưng không quá 60 ngày kể từ ngày hoàn thành lắp dựng xong cột anten.</w:t>
+      </w:r>
+    </w:p>
+    <w:p>
+      <w:pPr>
+        <w:pStyle w:val="ListParagraph"/>
         <w:numPr>
           <w:ilvl w:val="0"/>
           <w:numId w:val="3"/>
+        </w:numPr>
+        <w:spacing w:before="120" w:line="360" w:lineRule="exact"/>
+        <w:jc w:val="both"/>
+        <w:rPr>
+          <w:rFonts w:ascii="Times New Roman" w:hAnsi="Times New Roman"/>
+          <w:szCs w:val="26"/>
+          <w:lang w:val="vi-VN"/>
+        </w:rPr>
+      </w:pPr>
+      <w:r>
+        <w:rPr>
+          <w:rFonts w:ascii="Times New Roman" w:hAnsi="Times New Roman"/>
+          <w:b/>
+          <w:szCs w:val="26"/>
+          <w:lang w:val="vi-VN"/>
+        </w:rPr>
+        <w:t>Thông tin tài khoản nhận thanh toán là:</w:t>
+      </w:r>
+    </w:p>
+    <w:p>
+      <w:pPr>
+        <w:pStyle w:val="ListParagraph"/>
+        <w:numPr>
+          <w:ilvl w:val="0"/>
+          <w:numId w:val="5"/>
+        </w:numPr>
+        <w:spacing w:before="120" w:line="360" w:lineRule="exact"/>
+        <w:jc w:val="both"/>
+        <w:rPr>
+          <w:rFonts w:ascii="Times New Roman" w:hAnsi="Times New Roman"/>
+          <w:szCs w:val="26"/>
+          <w:lang w:val="vi-VN"/>
+        </w:rPr>
+      </w:pPr>
+      <w:r>
+        <w:rPr>
+          <w:rFonts w:ascii="Times New Roman" w:hAnsi="Times New Roman"/>
+          <w:b/>
+          <w:szCs w:val="26"/>
+        </w:rPr>
+        <w:t xml:space="preserve">Tên tài khoản: Hoàng Cá Tống - Đặng Thị Mộng Vân</w:t>
+      </w:r>
+    </w:p>
+    <w:p>
+      <w:pPr>
+        <w:pStyle w:val="ListParagraph"/>
+        <w:numPr>
+          <w:ilvl w:val="0"/>
+          <w:numId w:val="5"/>
+        </w:numPr>
+        <w:spacing w:before="120" w:line="360" w:lineRule="exact"/>
+        <w:jc w:val="both"/>
+        <w:rPr>
+          <w:rFonts w:ascii="Times New Roman" w:hAnsi="Times New Roman"/>
+          <w:szCs w:val="26"/>
+          <w:lang w:val="vi-VN"/>
+        </w:rPr>
+      </w:pPr>
+      <w:r>
+        <w:rPr>
+          <w:rFonts w:ascii="Times New Roman" w:hAnsi="Times New Roman"/>
+          <w:b/>
+          <w:szCs w:val="26"/>
+        </w:rPr>
+        <w:t xml:space="preserve">Số tài khoản: 5907205360232</w:t>
+      </w:r>
+    </w:p>
+    <w:p>
+      <w:pPr>
+        <w:pStyle w:val="ListParagraph"/>
+        <w:numPr>
+          <w:ilvl w:val="0"/>
+          <w:numId w:val="5"/>
+        </w:numPr>
+        <w:spacing w:before="120" w:line="360" w:lineRule="exact"/>
+        <w:jc w:val="both"/>
+        <w:rPr>
+          <w:rFonts w:ascii="Times New Roman" w:hAnsi="Times New Roman"/>
+          <w:szCs w:val="26"/>
+          <w:lang w:val="vi-VN"/>
+        </w:rPr>
+      </w:pPr>
+      <w:r>
+        <w:rPr>
+          <w:rFonts w:ascii="Times New Roman" w:hAnsi="Times New Roman"/>
+          <w:b/>
+          <w:szCs w:val="26"/>
+        </w:rPr>
+        <w:t xml:space="preserve">Tại ngân hàng: Argibank</w:t>
+      </w:r>
+    </w:p>
+    <w:p>
+      <w:pPr>
+        <w:pStyle w:val="ListParagraph"/>
+        <w:numPr>
+          <w:ilvl w:val="0"/>
+          <w:numId w:val="7"/>
+        </w:numPr>
+        <w:spacing w:before="120" w:line="360" w:lineRule="exact"/>
+        <w:jc w:val="both"/>
+        <w:rPr>
+          <w:rFonts w:ascii="Times New Roman" w:hAnsi="Times New Roman"/>
+          <w:b/>
+          <w:bCs/>
+          <w:szCs w:val="26"/>
+          <w:lang w:val="vi-VN"/>
+        </w:rPr>
+      </w:pPr>
+      <w:r>
+        <w:rPr>
+          <w:rFonts w:ascii="Times New Roman" w:hAnsi="Times New Roman"/>
+          <w:szCs w:val="26"/>
+          <w:lang w:val="vi-VN"/>
+        </w:rPr>
+        <w:t xml:space="preserve">Bên </w:t>
+      </w:r>
+      <w:r>
+        <w:rPr>
+          <w:rFonts w:ascii="Times New Roman" w:hAnsi="Times New Roman"/>
+          <w:szCs w:val="26"/>
+          <w:lang w:val="vi-VN"/>
+        </w:rPr>
+        <w:t>A</w:t>
+      </w:r>
+      <w:r>
+        <w:rPr>
+          <w:rFonts w:ascii="Times New Roman" w:hAnsi="Times New Roman"/>
+          <w:szCs w:val="26"/>
+          <w:lang w:val="vi-VN"/>
+        </w:rPr>
+        <w:t xml:space="preserve"> cam kết tài khoản nhận thanh toán là ổn định và không thay đổi trong suốt thời gian thuê, đồng thời chịu trách nhiệm nếu có bất kỳ khiếu nại nào liên quan đến việc nhận tiền thanh toán của hợp đồng này vào tài khoản nêu trên</w:t>
+      </w:r>
+    </w:p>
+    <w:p>
+      <w:pPr>
+        <w:pStyle w:val="ListParagraph"/>
+        <w:numPr>
+          <w:ilvl w:val="0"/>
+          <w:numId w:val="7"/>
+        </w:numPr>
+        <w:spacing w:before="120" w:line="360" w:lineRule="exact"/>
+        <w:jc w:val="both"/>
+        <w:rPr>
+          <w:rFonts w:ascii="Times New Roman" w:hAnsi="Times New Roman"/>
+          <w:szCs w:val="26"/>
+          <w:lang w:val="vi-VN"/>
+        </w:rPr>
+      </w:pPr>
+      <w:r>
+        <w:rPr>
+          <w:rFonts w:ascii="Times New Roman" w:hAnsi="Times New Roman"/>
+          <w:szCs w:val="26"/>
+          <w:lang w:val="vi-VN"/>
+        </w:rPr>
+        <w:lastRenderedPageBreak/>
+        <w:t xml:space="preserve">Trường hợp thay đổi thông tin tài khoản nhận thanh toán, Bên </w:t>
+      </w:r>
+      <w:r>
+        <w:rPr>
+          <w:rFonts w:ascii="Times New Roman" w:hAnsi="Times New Roman"/>
+          <w:szCs w:val="26"/>
+          <w:lang w:val="vi-VN"/>
+        </w:rPr>
+        <w:t>A</w:t>
+      </w:r>
+      <w:r>
+        <w:rPr>
+          <w:rFonts w:ascii="Times New Roman" w:hAnsi="Times New Roman"/>
+          <w:szCs w:val="26"/>
+          <w:lang w:val="vi-VN"/>
+        </w:rPr>
+        <w:t xml:space="preserve"> phải báo trước bằng văn bản cho bên </w:t>
+      </w:r>
+      <w:r>
+        <w:rPr>
+          <w:rFonts w:ascii="Times New Roman" w:hAnsi="Times New Roman"/>
+          <w:szCs w:val="26"/>
+          <w:lang w:val="vi-VN"/>
+        </w:rPr>
+        <w:t>B</w:t>
+      </w:r>
+      <w:r>
+        <w:rPr>
+          <w:rFonts w:ascii="Times New Roman" w:hAnsi="Times New Roman"/>
+          <w:szCs w:val="26"/>
+          <w:lang w:val="vi-VN"/>
+        </w:rPr>
+        <w:t xml:space="preserve"> chậm nhất là 30 ngày trước khi đến hạn của chu kỳ thanh toán kế tiếp và hai bên sẽ tiến hành ký phụ lục điều chỉnh thông tin tài khoản nhận tiền thanh toán.</w:t>
+      </w:r>
+    </w:p>
+    <w:p>
+      <w:pPr>
+        <w:numPr>
+          <w:ilvl w:val="0"/>
+          <w:numId w:val="28"/>
         </w:numPr>
         <w:tabs>
           <w:tab w:val="num" w:pos="709"/>
@@ -5611,12 +5963,89 @@
         <w:autoSpaceDE w:val="0"/>
         <w:autoSpaceDN w:val="0"/>
         <w:spacing w:before="120" w:after="60"/>
-        <w:jc w:val="both"/>
-        <w:rPr>
-          <w:rFonts w:ascii="Times New Roman" w:hAnsi="Times New Roman"/>
-          <w:szCs w:val="26"/>
-        </w:rPr>
-      </w:pPr>
+        <w:ind w:left="0" w:firstLine="567"/>
+        <w:jc w:val="both"/>
+        <w:rPr>
+          <w:rFonts w:ascii="Times New Roman" w:hAnsi="Times New Roman"/>
+          <w:szCs w:val="26"/>
+        </w:rPr>
+      </w:pPr>
+      <w:r>
+        <w:rPr>
+          <w:rFonts w:ascii="Times New Roman" w:hAnsi="Times New Roman"/>
+          <w:i/>
+          <w:szCs w:val="26"/>
+          <w:lang w:val="vi-VN"/>
+        </w:rPr>
+        <w:t>Chu</w:t>
+      </w:r>
+      <w:r>
+        <w:rPr>
+          <w:rFonts w:ascii="Times New Roman" w:hAnsi="Times New Roman"/>
+          <w:i/>
+          <w:spacing w:val="-1"/>
+          <w:szCs w:val="26"/>
+          <w:lang w:val="vi-VN"/>
+        </w:rPr>
+        <w:t xml:space="preserve"> </w:t>
+      </w:r>
+      <w:r>
+        <w:rPr>
+          <w:rFonts w:ascii="Times New Roman" w:hAnsi="Times New Roman"/>
+          <w:i/>
+          <w:szCs w:val="26"/>
+          <w:lang w:val="vi-VN"/>
+        </w:rPr>
+        <w:t>kỳ</w:t>
+      </w:r>
+      <w:r>
+        <w:rPr>
+          <w:rFonts w:ascii="Times New Roman" w:hAnsi="Times New Roman"/>
+          <w:i/>
+          <w:spacing w:val="-1"/>
+          <w:szCs w:val="26"/>
+          <w:lang w:val="vi-VN"/>
+        </w:rPr>
+        <w:t xml:space="preserve"> </w:t>
+      </w:r>
+      <w:r>
+        <w:rPr>
+          <w:rFonts w:ascii="Times New Roman" w:hAnsi="Times New Roman"/>
+          <w:i/>
+          <w:szCs w:val="26"/>
+          <w:lang w:val="vi-VN"/>
+        </w:rPr>
+        <w:t>thanh</w:t>
+      </w:r>
+      <w:r>
+        <w:rPr>
+          <w:rFonts w:ascii="Times New Roman" w:hAnsi="Times New Roman"/>
+          <w:i/>
+          <w:spacing w:val="-1"/>
+          <w:szCs w:val="26"/>
+          <w:lang w:val="vi-VN"/>
+        </w:rPr>
+        <w:t xml:space="preserve"> </w:t>
+      </w:r>
+      <w:r>
+        <w:rPr>
+          <w:rFonts w:ascii="Times New Roman" w:hAnsi="Times New Roman"/>
+          <w:i/>
+          <w:szCs w:val="26"/>
+          <w:lang w:val="vi-VN"/>
+        </w:rPr>
+        <w:t>toán:</w:t>
+      </w:r>
+      <w:r>
+        <w:rPr>
+          <w:rFonts w:ascii="Times New Roman" w:hAnsi="Times New Roman"/>
+          <w:i/>
+          <w:spacing w:val="-1"/>
+          <w:szCs w:val="26"/>
+          <w:lang w:val="vi-VN"/>
+        </w:rPr>
+        <w:t xml:space="preserve"> </w:t>
+      </w:r>
       <w:r>
         <w:rPr>
           <w:rFonts w:ascii="Times New Roman" w:hAnsi="Times New Roman"/>
@@ -5882,6 +6311,7 @@
         </w:rPr>
         <w:t xml:space="preserve"> </w:t>
       </w:r>
+      <w:proofErr w:type="gramStart"/>
       <w:r>
         <w:rPr>
           <w:rFonts w:ascii="Times New Roman" w:hAnsi="Times New Roman"/>
@@ -5902,7 +6332,15 @@
           <w:rFonts w:ascii="Times New Roman" w:hAnsi="Times New Roman"/>
           <w:szCs w:val="26"/>
         </w:rPr>
-        <w:t>31/12 của</w:t>
+        <w:t>31</w:t>
+      </w:r>
+      <w:proofErr w:type="gramEnd"/>
+      <w:r>
+        <w:rPr>
+          <w:rFonts w:ascii="Times New Roman" w:hAnsi="Times New Roman"/>
+          <w:szCs w:val="26"/>
+        </w:rPr>
+        <w:t>/12 của</w:t>
       </w:r>
       <w:r>
         <w:rPr>
@@ -6054,8 +6492,16 @@
         <w:rPr>
           <w:rFonts w:ascii="Times New Roman" w:hAnsi="Times New Roman"/>
           <w:szCs w:val="26"/>
-        </w:rPr>
-        <w:t xml:space="preserve">6 tháng/lần</w:t>
+          <w:lang w:val="vi-VN"/>
+        </w:rPr>
+        <w:t>06 tháng</w:t>
+      </w:r>
+      <w:r>
+        <w:rPr>
+          <w:rFonts w:ascii="Times New Roman" w:hAnsi="Times New Roman"/>
+          <w:szCs w:val="26"/>
+        </w:rPr>
+        <w:t>/lần</w:t>
       </w:r>
       <w:r>
         <w:rPr>
@@ -6092,7 +6538,7 @@
       <w:pPr>
         <w:numPr>
           <w:ilvl w:val="0"/>
-          <w:numId w:val="3"/>
+          <w:numId w:val="28"/>
         </w:numPr>
         <w:tabs>
           <w:tab w:val="num" w:pos="709"/>
@@ -6100,6 +6546,7 @@
         <w:autoSpaceDE w:val="0"/>
         <w:autoSpaceDN w:val="0"/>
         <w:spacing w:before="120" w:after="60"/>
+        <w:ind w:left="0" w:firstLine="567"/>
         <w:jc w:val="both"/>
         <w:rPr>
           <w:rFonts w:ascii="Times New Roman" w:hAnsi="Times New Roman"/>
@@ -6114,378 +6561,6 @@
         <w:t>Phương thức thanh toán: Chuyển khoản.</w:t>
       </w:r>
     </w:p>
-    <w:p>
-      <w:pPr>
-        <w:pStyle w:val="BodyTextIndent3"/>
-        <w:numPr>
-          <w:ilvl w:val="0"/>
-          <w:numId w:val="3"/>
-        </w:numPr>
-        <w:tabs>
-          <w:tab w:val="clear" w:pos="180"/>
-        </w:tabs>
-        <w:suppressAutoHyphens/>
-        <w:autoSpaceDE/>
-        <w:autoSpaceDN/>
-        <w:rPr>
-          <w:rFonts w:ascii="Times New Roman" w:hAnsi="Times New Roman"/>
-          <w:bCs/>
-          <w:iCs/>
-          <w:color w:val="000000" w:themeColor="text1"/>
-          <w:spacing w:val="-2"/>
-          <w:sz w:val="26"/>
-          <w:szCs w:val="26"/>
-          <w:lang w:val="vi-VN"/>
-        </w:rPr>
-      </w:pPr>
-      <w:r>
-        <w:rPr>
-          <w:rFonts w:ascii="Times New Roman" w:hAnsi="Times New Roman"/>
-          <w:szCs w:val="26"/>
-        </w:rPr>
-        <w:t xml:space="preserve">Thời điểm thanh toán: </w:t>
-      </w:r>
-      <w:r>
-        <w:rPr>
-          <w:rFonts w:ascii="Times New Roman" w:hAnsi="Times New Roman"/>
-          <w:bCs/>
-          <w:iCs/>
-          <w:color w:val="000000" w:themeColor="text1"/>
-          <w:spacing w:val="-2"/>
-          <w:sz w:val="26"/>
-          <w:szCs w:val="26"/>
-        </w:rPr>
-        <w:t>Kể từ thời điểm MobiFone hoàn thành lắp đặt, phát sóng trạm ( thể hiện bằng biên bản phát sóng) nhưng không quá 60 ngày kể từ ngày hoàn thành lắp dựng xong cột anten.</w:t>
-      </w:r>
-    </w:p>
-    <w:p>
-      <w:pPr>
-        <w:pStyle w:val="ListParagraph"/>
-        <w:numPr>
-          <w:ilvl w:val="0"/>
-          <w:numId w:val="3"/>
-        </w:numPr>
-        <w:spacing w:before="120" w:line="360" w:lineRule="exact"/>
-        <w:jc w:val="both"/>
-        <w:rPr>
-          <w:rFonts w:ascii="Times New Roman" w:hAnsi="Times New Roman"/>
-          <w:szCs w:val="26"/>
-          <w:lang w:val="vi-VN"/>
-        </w:rPr>
-      </w:pPr>
-      <w:r>
-        <w:rPr>
-          <w:rFonts w:ascii="Times New Roman" w:hAnsi="Times New Roman"/>
-          <w:b/>
-          <w:szCs w:val="26"/>
-          <w:lang w:val="vi-VN"/>
-        </w:rPr>
-        <w:lastRenderedPageBreak/>
-        <w:t>Thông tin tài khoản nhận thanh toán là:</w:t>
-      </w:r>
-    </w:p>
-    <w:p>
-      <w:pPr>
-        <w:pStyle w:val="ListParagraph"/>
-        <w:numPr>
-          <w:ilvl w:val="0"/>
-          <w:numId w:val="5"/>
-        </w:numPr>
-        <w:spacing w:before="120" w:line="360" w:lineRule="exact"/>
-        <w:jc w:val="both"/>
-        <w:rPr>
-          <w:rFonts w:ascii="Times New Roman" w:hAnsi="Times New Roman"/>
-          <w:szCs w:val="26"/>
-          <w:lang w:val="vi-VN"/>
-        </w:rPr>
-      </w:pPr>
-      <w:r>
-        <w:rPr>
-          <w:rFonts w:ascii="Times New Roman" w:hAnsi="Times New Roman"/>
-          <w:b/>
-          <w:szCs w:val="26"/>
-        </w:rPr>
-        <w:t xml:space="preserve">Tên tài khoản: Hoàng Cá Tống - Đặng Thị Mộng Vân</w:t>
-      </w:r>
-    </w:p>
-    <w:p>
-      <w:pPr>
-        <w:pStyle w:val="ListParagraph"/>
-        <w:numPr>
-          <w:ilvl w:val="0"/>
-          <w:numId w:val="5"/>
-        </w:numPr>
-        <w:spacing w:before="120" w:line="360" w:lineRule="exact"/>
-        <w:jc w:val="both"/>
-        <w:rPr>
-          <w:rFonts w:ascii="Times New Roman" w:hAnsi="Times New Roman"/>
-          <w:szCs w:val="26"/>
-          <w:lang w:val="vi-VN"/>
-        </w:rPr>
-      </w:pPr>
-      <w:r>
-        <w:rPr>
-          <w:rFonts w:ascii="Times New Roman" w:hAnsi="Times New Roman"/>
-          <w:b/>
-          <w:szCs w:val="26"/>
-        </w:rPr>
-        <w:t xml:space="preserve">Số tài khoản: 5907205360232</w:t>
-      </w:r>
-    </w:p>
-    <w:p>
-      <w:pPr>
-        <w:pStyle w:val="ListParagraph"/>
-        <w:numPr>
-          <w:ilvl w:val="0"/>
-          <w:numId w:val="5"/>
-        </w:numPr>
-        <w:spacing w:before="120" w:line="360" w:lineRule="exact"/>
-        <w:jc w:val="both"/>
-        <w:rPr>
-          <w:rFonts w:ascii="Times New Roman" w:hAnsi="Times New Roman"/>
-          <w:szCs w:val="26"/>
-          <w:lang w:val="vi-VN"/>
-        </w:rPr>
-      </w:pPr>
-      <w:r>
-        <w:rPr>
-          <w:rFonts w:ascii="Times New Roman" w:hAnsi="Times New Roman"/>
-          <w:b/>
-          <w:szCs w:val="26"/>
-        </w:rPr>
-        <w:t xml:space="preserve">Tại ngân hàng: Argibank</w:t>
-      </w:r>
-    </w:p>
-    <w:p>
-      <w:pPr>
-        <w:pStyle w:val="ListParagraph"/>
-        <w:numPr>
-          <w:ilvl w:val="0"/>
-          <w:numId w:val="7"/>
-        </w:numPr>
-        <w:spacing w:before="120" w:line="360" w:lineRule="exact"/>
-        <w:jc w:val="both"/>
-        <w:rPr>
-          <w:rFonts w:ascii="Times New Roman" w:hAnsi="Times New Roman"/>
-          <w:b/>
-          <w:bCs/>
-          <w:szCs w:val="26"/>
-          <w:lang w:val="vi-VN"/>
-        </w:rPr>
-      </w:pPr>
-      <w:r>
-        <w:rPr>
-          <w:rFonts w:ascii="Times New Roman" w:hAnsi="Times New Roman"/>
-        </w:rPr>
-        <w:t>Bên A cam kết tài khoản nhận thanh toán là ổn định và không thay đổi trong suốt thời gian thuê, đồng thời chịu trách nhiệm nếu có bất kỳ khiếu nại nào liên quan đến việc nhận tiền thanh toán của hợp đồng này vào tài khoản nêu trên</w:t>
-      </w:r>
-    </w:p>
-    <w:p>
-      <w:pPr>
-        <w:pStyle w:val="ListParagraph"/>
-        <w:numPr>
-          <w:ilvl w:val="0"/>
-          <w:numId w:val="7"/>
-        </w:numPr>
-        <w:spacing w:before="120" w:line="360" w:lineRule="exact"/>
-        <w:jc w:val="both"/>
-        <w:rPr>
-          <w:rFonts w:ascii="Times New Roman" w:hAnsi="Times New Roman"/>
-          <w:szCs w:val="26"/>
-          <w:lang w:val="vi-VN"/>
-        </w:rPr>
-      </w:pPr>
-      <w:r>
-        <w:rPr>
-          <w:rFonts w:ascii="Times New Roman" w:hAnsi="Times New Roman"/>
-        </w:rPr>
-        <w:t>Trường hợp thay đổi thông tin tài khoản nhận thanh toán, Bên A phải báo trước bằng văn bản cho bên B chậm nhất là 30 ngày trước khi đến hạn của chu kỳ thanh toán kế tiếp và hai bên sẽ tiến hành ký phụ lục điều chỉnh thông tin tài khoản nhận tiền thanh toán.</w:t>
-      </w:r>
-    </w:p>
-    <w:p>
-      <w:pPr>
-        <w:pStyle w:val="ListParagraph"/>
-        <w:numPr>
-          <w:ilvl w:val="0"/>
-          <w:numId w:val="7"/>
-        </w:numPr>
-        <w:spacing w:before="120" w:line="320" w:lineRule="exact"/>
-        <w:jc w:val="both"/>
-        <w:rPr>
-          <w:rFonts w:ascii="Times New Roman" w:hAnsi="Times New Roman"/>
-          <w:i/>
-          <w:szCs w:val="26"/>
-          <w:lang w:val="en-SG"/>
-        </w:rPr>
-      </w:pPr>
-      <w:r>
-        <w:rPr>
-          <w:rFonts w:ascii="Times New Roman" w:hAnsi="Times New Roman"/>
-          <w:i/>
-          <w:szCs w:val="26"/>
-          <w:lang w:val="vi-VN"/>
-        </w:rPr>
-        <w:t>Chu</w:t>
-      </w:r>
-      <w:r>
-        <w:rPr>
-          <w:rFonts w:ascii="Times New Roman" w:hAnsi="Times New Roman"/>
-          <w:i/>
-          <w:spacing w:val="-1"/>
-          <w:szCs w:val="26"/>
-          <w:lang w:val="vi-VN"/>
-        </w:rPr>
-        <w:t xml:space="preserve"> </w:t>
-      </w:r>
-      <w:r>
-        <w:rPr>
-          <w:rFonts w:ascii="Times New Roman" w:hAnsi="Times New Roman"/>
-          <w:i/>
-          <w:szCs w:val="26"/>
-          <w:lang w:val="vi-VN"/>
-        </w:rPr>
-        <w:t>kỳ</w:t>
-      </w:r>
-      <w:r>
-        <w:rPr>
-          <w:rFonts w:ascii="Times New Roman" w:hAnsi="Times New Roman"/>
-          <w:i/>
-          <w:spacing w:val="-1"/>
-          <w:szCs w:val="26"/>
-          <w:lang w:val="vi-VN"/>
-        </w:rPr>
-        <w:t xml:space="preserve"> </w:t>
-      </w:r>
-      <w:r>
-        <w:rPr>
-          <w:rFonts w:ascii="Times New Roman" w:hAnsi="Times New Roman"/>
-          <w:i/>
-          <w:szCs w:val="26"/>
-          <w:lang w:val="vi-VN"/>
-        </w:rPr>
-        <w:t>thanh</w:t>
-      </w:r>
-      <w:r>
-        <w:rPr>
-          <w:rFonts w:ascii="Times New Roman" w:hAnsi="Times New Roman"/>
-          <w:i/>
-          <w:spacing w:val="-1"/>
-          <w:szCs w:val="26"/>
-          <w:lang w:val="vi-VN"/>
-        </w:rPr>
-        <w:t xml:space="preserve"> </w:t>
-      </w:r>
-      <w:r>
-        <w:rPr>
-          <w:rFonts w:ascii="Times New Roman" w:hAnsi="Times New Roman"/>
-          <w:i/>
-          <w:szCs w:val="26"/>
-          <w:lang w:val="vi-VN"/>
-        </w:rPr>
-        <w:t>toán:</w:t>
-      </w:r>
-      <w:r>
-        <w:rPr>
-          <w:rFonts w:ascii="Times New Roman" w:hAnsi="Times New Roman"/>
-          <w:i/>
-          <w:spacing w:val="-1"/>
-          <w:szCs w:val="26"/>
-          <w:lang w:val="vi-VN"/>
-        </w:rPr>
-        <w:t xml:space="preserve"> </w:t>
-      </w:r>
-      <w:r>
-        <w:rPr>
-          <w:rFonts w:ascii="Times New Roman" w:hAnsi="Times New Roman"/>
-          <w:szCs w:val="26"/>
-          <w:lang w:val="vi-VN"/>
-        </w:rPr>
-        <w:t>06 tháng/ lần</w:t>
-      </w:r>
-      <w:r>
-        <w:rPr>
-          <w:rFonts w:ascii="Times New Roman" w:hAnsi="Times New Roman"/>
-          <w:i/>
-          <w:szCs w:val="26"/>
-          <w:lang w:val="vi-VN"/>
-        </w:rPr>
-        <w:t>,</w:t>
-      </w:r>
-      <w:r>
-        <w:rPr>
-          <w:rFonts w:ascii="Times New Roman" w:hAnsi="Times New Roman"/>
-          <w:i/>
-          <w:spacing w:val="-1"/>
-          <w:szCs w:val="26"/>
-          <w:lang w:val="vi-VN"/>
-        </w:rPr>
-        <w:t xml:space="preserve"> </w:t>
-      </w:r>
-      <w:r>
-        <w:rPr>
-          <w:rFonts w:ascii="Times New Roman" w:hAnsi="Times New Roman"/>
-          <w:i/>
-          <w:szCs w:val="26"/>
-          <w:lang w:val="vi-VN"/>
-        </w:rPr>
-        <w:t>cụ</w:t>
-      </w:r>
-      <w:r>
-        <w:rPr>
-          <w:rFonts w:ascii="Times New Roman" w:hAnsi="Times New Roman"/>
-          <w:i/>
-          <w:spacing w:val="-3"/>
-          <w:szCs w:val="26"/>
-          <w:lang w:val="vi-VN"/>
-        </w:rPr>
-        <w:t xml:space="preserve"> </w:t>
-      </w:r>
-      <w:r>
-        <w:rPr>
-          <w:rFonts w:ascii="Times New Roman" w:hAnsi="Times New Roman"/>
-          <w:i/>
-          <w:szCs w:val="26"/>
-          <w:lang w:val="vi-VN"/>
-        </w:rPr>
-        <w:t>thể:</w:t>
-      </w:r>
-    </w:p>
-    <w:tbl>
-      <w:tblPr>
-        <w:tblW w:w="8640" w:type="dxa"/>
-        <w:jc w:val="center"/>
-        <w:tblLook w:val="04A0" w:firstRow="1" w:lastRow="0" w:firstColumn="1" w:lastColumn="0" w:noHBand="0" w:noVBand="1"/>
-      </w:tblPr>
-      <w:tblGrid>
-        <w:gridCol w:w="8640"/>
-      </w:tblGrid>
-      <w:tr>
-        <w:trPr>
-          <w:trHeight w:val="432"/>
-          <w:jc w:val="center"/>
-        </w:trPr>
-        <w:tc>
-          <w:tcPr>
-            <w:tcW w:w="8640" w:type="dxa"/>
-          </w:tcPr>
-          <w:p>
-            <w:pPr>
-              <w:rPr>
-                <w:rFonts w:ascii="Times New Roman" w:hAnsi="Times New Roman"/>
-                <w:szCs w:val="26"/>
-              </w:rPr>
-            </w:pPr>
-            <w:r>
-              <w:rPr>
-                <w:rFonts w:ascii="Times New Roman" w:hAnsi="Times New Roman"/>
-                <w:szCs w:val="26"/>
-              </w:rPr>
-              <w:t xml:space="preserve">Thanh toán theo chu kỳ 6 tháng.</w:t>
-            </w:r>
-          </w:p>
-        </w:tc>
-      </w:tr>
-    </w:tbl>
     <w:p>
       <w:pPr>
         <w:widowControl w:val="0"/>
@@ -6630,7 +6705,7 @@
         <w:tab/>
         <w:t xml:space="preserve">: </w:t>
       </w:r>
-      <w:bookmarkStart w:id="1" w:name="_Hlk220074608"/>
+      <w:bookmarkStart w:id="2" w:name="_Hlk220074608"/>
       <w:r>
         <w:rPr>
           <w:rFonts w:ascii="Times New Roman" w:hAnsi="Times New Roman"/>
@@ -6639,7 +6714,7 @@
         </w:rPr>
         <w:t>0909 302 603 (chị Ngọc)</w:t>
       </w:r>
-      <w:bookmarkEnd w:id="1"/>
+      <w:bookmarkEnd w:id="2"/>
     </w:p>
     <w:p>
       <w:pPr>
@@ -6875,16 +6950,7 @@
           <w:szCs w:val="26"/>
           <w:lang w:val="da-DK"/>
         </w:rPr>
-        <w:t xml:space="preserve">- Bên A thanh toán các chi phí phát sinh khi chuyển mục đích sử dụng đất nhằm </w:t>
-      </w:r>
-      <w:r>
-        <w:rPr>
-          <w:rFonts w:ascii="Times New Roman" w:hAnsi="Times New Roman"/>
-          <w:szCs w:val="26"/>
-          <w:lang w:val="da-DK"/>
-        </w:rPr>
-        <w:lastRenderedPageBreak/>
-        <w:t>mục đích xin các loại giấy phép phục vụ việc xây dựng trạm BTS.</w:t>
+        <w:t>- Bên A thanh toán các chi phí phát sinh khi chuyển mục đích sử dụng đất nhằm mục đích xin các loại giấy phép phục vụ việc xây dựng trạm BTS.</w:t>
       </w:r>
     </w:p>
     <w:p>
@@ -6926,7 +6992,26 @@
           <w:szCs w:val="26"/>
           <w:lang w:val="da-DK"/>
         </w:rPr>
-        <w:t>- Bên A phải đảm bảo mọi sự chuyển dịch quyền sở hữu nhà đất hoặc cho thuê, thế chấp,… không được ảnh hưởng quyền thuê của bên B. Trách nhiệm của hai bên vẫn phải được tiến hành theo nội dung của hợp đồng này và hợp đồng này vẫn phải có hiệu lực cho đến hết thời hạn được nêu ở điều 2, tạo mọi điều kiện thuận lợi để bên B sử dụng mặt bằng/hạ tầng có sẵn đã thuê.</w:t>
+        <w:lastRenderedPageBreak/>
+        <w:t xml:space="preserve">- Bên A phải đảm bảo mọi sự chuyển dịch quyền sở hữu nhà đất hoặc cho thuê, thế </w:t>
+      </w:r>
+      <w:proofErr w:type="gramStart"/>
+      <w:r>
+        <w:rPr>
+          <w:rFonts w:ascii="Times New Roman" w:hAnsi="Times New Roman"/>
+          <w:szCs w:val="26"/>
+          <w:lang w:val="da-DK"/>
+        </w:rPr>
+        <w:t>chấp,…</w:t>
+      </w:r>
+      <w:proofErr w:type="gramEnd"/>
+      <w:r>
+        <w:rPr>
+          <w:rFonts w:ascii="Times New Roman" w:hAnsi="Times New Roman"/>
+          <w:szCs w:val="26"/>
+          <w:lang w:val="da-DK"/>
+        </w:rPr>
+        <w:t xml:space="preserve"> không được ảnh hưởng quyền thuê của bên B. Trách nhiệm của hai bên vẫn phải được tiến hành theo nội dung của hợp đồng này và hợp đồng này vẫn phải có hiệu lực cho đến hết thời hạn được nêu ở điều 2, tạo mọi điều kiện thuận lợi để bên B sử dụng mặt bằng/hạ tầng có sẵn đã thuê.</w:t>
       </w:r>
     </w:p>
     <w:p>
@@ -7055,7 +7140,25 @@
           <w:szCs w:val="26"/>
           <w:lang w:val="da-DK"/>
         </w:rPr>
-        <w:t xml:space="preserve">- Bên A phải thông báo bằng văn bản cho Bên B về việc chuyển quyền sở hữu nhà đất (mua bán, thừa kế,…) cũng như việc cho thuê, thế chấp </w:t>
+        <w:t xml:space="preserve">- Bên A phải thông báo bằng văn bản cho Bên B về việc chuyển quyền sở hữu nhà đất (mua bán, thừa </w:t>
+      </w:r>
+      <w:proofErr w:type="gramStart"/>
+      <w:r>
+        <w:rPr>
+          <w:rFonts w:ascii="Times New Roman" w:hAnsi="Times New Roman"/>
+          <w:szCs w:val="26"/>
+          <w:lang w:val="da-DK"/>
+        </w:rPr>
+        <w:t>kế,…</w:t>
+      </w:r>
+      <w:proofErr w:type="gramEnd"/>
+      <w:r>
+        <w:rPr>
+          <w:rFonts w:ascii="Times New Roman" w:hAnsi="Times New Roman"/>
+          <w:szCs w:val="26"/>
+          <w:lang w:val="da-DK"/>
+        </w:rPr>
+        <w:t xml:space="preserve">) cũng như việc cho thuê, thế chấp </w:t>
       </w:r>
       <w:r>
         <w:rPr>
@@ -7093,7 +7196,25 @@
           <w:szCs w:val="26"/>
           <w:lang w:val="da-DK"/>
         </w:rPr>
-        <w:t>- Bên A phối hợp, kiểm tra giám sát khu vực nhà trạm, kịp thời thông báo cho Bên B các điều kiện không đảm bảo an toàn hoạt động của nhà trạm và các thiết bị của Bên B (hệ thống thoát nước, hệ thống điện, phòng chống cháy nổ, hệ thống tiếp đất chống sét,…). Bên A phối hợp giúp đỡ Bên B để khắc phục sửa chữa kịp thời những hư hỏng đó. Mọi việc sửa chữa đột xuất của Bên A có ảnh hưởng đến hoạt động của trạm viễn thông phải báo trước 48 giờ cho Bên B để phối hợp giải quyết.</w:t>
+        <w:t xml:space="preserve">- Bên A phối hợp, kiểm tra giám sát khu vực nhà trạm, kịp thời thông báo cho Bên B các điều kiện không đảm bảo an toàn hoạt động của nhà trạm và các thiết bị của Bên B (hệ thống thoát nước, hệ thống điện, phòng chống cháy nổ, hệ thống tiếp đất chống </w:t>
+      </w:r>
+      <w:proofErr w:type="gramStart"/>
+      <w:r>
+        <w:rPr>
+          <w:rFonts w:ascii="Times New Roman" w:hAnsi="Times New Roman"/>
+          <w:szCs w:val="26"/>
+          <w:lang w:val="da-DK"/>
+        </w:rPr>
+        <w:t>sét,…</w:t>
+      </w:r>
+      <w:proofErr w:type="gramEnd"/>
+      <w:r>
+        <w:rPr>
+          <w:rFonts w:ascii="Times New Roman" w:hAnsi="Times New Roman"/>
+          <w:szCs w:val="26"/>
+          <w:lang w:val="da-DK"/>
+        </w:rPr>
+        <w:t>). Bên A phối hợp giúp đỡ Bên B để khắc phục sửa chữa kịp thời những hư hỏng đó. Mọi việc sửa chữa đột xuất của Bên A có ảnh hưởng đến hoạt động của trạm viễn thông phải báo trước 48 giờ cho Bên B để phối hợp giải quyết.</w:t>
       </w:r>
     </w:p>
     <w:p>
@@ -7156,16 +7277,7 @@
           <w:szCs w:val="26"/>
           <w:lang w:val="da-DK"/>
         </w:rPr>
-        <w:t xml:space="preserve">- Bảo đảm an ninh, an toàn khu vực nhà trạm và các vật tư thiết bị của trạm, không cho người lạ vào phòng máy hoặc can thiệp vào các thiết bị của trạm. Nếu việc cháy, hỏng, mất mát các tài sản đó do lỗi của Bên A thì Bên A phải sửa chữa, khôi phục </w:t>
-      </w:r>
-      <w:r>
-        <w:rPr>
-          <w:rFonts w:ascii="Times New Roman" w:hAnsi="Times New Roman"/>
-          <w:szCs w:val="26"/>
-          <w:lang w:val="da-DK"/>
-        </w:rPr>
-        <w:lastRenderedPageBreak/>
-        <w:t>tài sản của bên B như ban đầu. Nếu có mất mát Bên A phải báo cơ quan chức năng và bên B để cùng tìm hướng giải quyết.</w:t>
+        <w:t>- Bảo đảm an ninh, an toàn khu vực nhà trạm và các vật tư thiết bị của trạm, không cho người lạ vào phòng máy hoặc can thiệp vào các thiết bị của trạm. Nếu việc cháy, hỏng, mất mát các tài sản đó do lỗi của Bên A thì Bên A phải sửa chữa, khôi phục tài sản của bên B như ban đầu. Nếu có mất mát Bên A phải báo cơ quan chức năng và bên B để cùng tìm hướng giải quyết.</w:t>
       </w:r>
     </w:p>
     <w:p>
@@ -7207,6 +7319,7 @@
           <w:szCs w:val="26"/>
           <w:lang w:val="da-DK"/>
         </w:rPr>
+        <w:lastRenderedPageBreak/>
         <w:t>- Kiểm tra giấy tờ (thẻ cán bộ CNV MobiFone, CCCD…) và tạo điều kiện thuận lợi khi các kỹ sư, công nhân viên, chuyên gia Việt Nam và nước ngoài mang máy móc thiết bị, vật tư ra vào trạm trong quá trình lắp đặt, vận hành và ứng cứu thông tin.</w:t>
       </w:r>
     </w:p>
@@ -7228,7 +7341,7 @@
           <w:szCs w:val="26"/>
           <w:lang w:val="da-DK"/>
         </w:rPr>
-        <w:t>- Trong mọi trường hợp (ngoại trừ bất khả kháng, trở ngại khách quan theo luật định), Bên A không được gây gián đoạn hoạt động bình thường của trạm thu 8 phát sóng và/hoặc cản trở cán bộ kỹ thuật của Bên B thực hiện công việc vận hành khai thác và ứng cứu thông tin tại trạm.</w:t>
+        <w:t>- Trong mọi trường hợp (ngoại trừ bất khả kháng, trở ngại khách quan theo luật định), Bên A không được gây gián đoạn hoạt động bình thường của trạm thu phát sóng và/hoặc cản trở cán bộ kỹ thuật của Bên B thực hiện công việc vận hành khai thác và ứng cứu thông tin tại trạm.</w:t>
       </w:r>
     </w:p>
     <w:p>
@@ -7520,7 +7633,6 @@
           <w:szCs w:val="26"/>
           <w:lang w:val="da-DK"/>
         </w:rPr>
-        <w:lastRenderedPageBreak/>
         <w:t>- Trường hợp nếu chưa có nguồn điện lưới riêng cho trạm thì Bên B sẽ được sử dụng điện của Bên A và Bên B sẽ thanh toán chi phí sử dụng điện theo thực tế phát sinh tại nguồn điện của Bên A và tuân thủ theo quy định của ngành điện.</w:t>
       </w:r>
     </w:p>
@@ -7542,7 +7654,16 @@
           <w:szCs w:val="26"/>
           <w:lang w:val="da-DK"/>
         </w:rPr>
-        <w:t>- Cán bộ, công nhân viên và đối tác của Bên B khi đến trạm làm nhiệm vụ phải xuất trình giấy tờ khi ra vào trạm (chứng minh nhân dân, thẻ cán bộ CNV MobiFone, Giấy giới thiệu …).</w:t>
+        <w:t xml:space="preserve">- Cán bộ, công nhân viên và đối tác của Bên B khi đến trạm làm nhiệm vụ phải </w:t>
+      </w:r>
+      <w:r>
+        <w:rPr>
+          <w:rFonts w:ascii="Times New Roman" w:hAnsi="Times New Roman"/>
+          <w:szCs w:val="26"/>
+          <w:lang w:val="da-DK"/>
+        </w:rPr>
+        <w:lastRenderedPageBreak/>
+        <w:t>xuất trình giấy tờ khi ra vào trạm (chứng minh nhân dân, thẻ cán bộ CNV MobiFone, Giấy giới thiệu …).</w:t>
       </w:r>
     </w:p>
     <w:p>
@@ -8045,7 +8166,6 @@
           <w:szCs w:val="26"/>
           <w:lang w:val="da-DK"/>
         </w:rPr>
-        <w:lastRenderedPageBreak/>
         <w:t>- Trong trường hợp Bên B không thể tiến hành thi công xây dựng hoặc không thể lắp đặt được các thiết bị cho trạm BTS hoặc phải tháo dỡ di chuyển trạm BTS thì hai Bên cùng tiến hành lập biên bản xác nhận và tiến hành thanh lý hợp đồng, không tiếp tục thực hiện hợp đồng thuê.</w:t>
       </w:r>
     </w:p>
@@ -8067,6 +8187,7 @@
           <w:szCs w:val="26"/>
           <w:lang w:val="da-DK"/>
         </w:rPr>
+        <w:lastRenderedPageBreak/>
         <w:t>- Số điện thoại, liên lạc của các bên:</w:t>
       </w:r>
     </w:p>
@@ -8222,7 +8343,25 @@
           <w:szCs w:val="26"/>
           <w:lang w:val="da-DK"/>
         </w:rPr>
-        <w:t>- Trường hợp chấm dứt hợp đồng trái pháp luật (trừ trường hợp quy định tại Điều 6), ngoài việc trả lại tiền thuê mặt bằng/CSHT cho những tháng Bên B chưa sử dụng, Bên A phải bồi thường giá trị tương đương 03 (ba) tháng tiền thuê mặt bằng/CSHT và toàn bộ những thiệt hại phát sinh từ việc chấm dứt hợp đồng (Việc phát sinh do bên thuê thống kê gửi bên cho thuê). Thiệt hại đó bao gồm nhưng không giới hạn cả phần giá trị chưa khấu hao chi phí xây dựng, lắp đặt, sửa chữa, nâng cấp, cải tạo, di dời nhà trạm,… và toàn bộ những thiệt hại thực tế làm ảnh hưởng đến chất lượng dịch vụ do Bên B cung cấp.</w:t>
+        <w:t xml:space="preserve">- Trường hợp chấm dứt hợp đồng trái pháp luật (trừ trường hợp quy định tại Điều 6), ngoài việc trả lại tiền thuê mặt bằng/CSHT cho những tháng Bên B chưa sử dụng, Bên A phải bồi thường giá trị tương đương 03 (ba) tháng tiền thuê mặt bằng/CSHT và toàn bộ những thiệt hại phát sinh từ việc chấm dứt hợp đồng (Việc phát sinh do bên thuê thống kê gửi bên cho thuê). Thiệt hại đó bao gồm nhưng không giới hạn cả phần giá trị chưa khấu hao chi phí xây dựng, lắp đặt, sửa chữa, nâng cấp, cải tạo, di dời nhà </w:t>
+      </w:r>
+      <w:proofErr w:type="gramStart"/>
+      <w:r>
+        <w:rPr>
+          <w:rFonts w:ascii="Times New Roman" w:hAnsi="Times New Roman"/>
+          <w:szCs w:val="26"/>
+          <w:lang w:val="da-DK"/>
+        </w:rPr>
+        <w:t>trạm,…</w:t>
+      </w:r>
+      <w:proofErr w:type="gramEnd"/>
+      <w:r>
+        <w:rPr>
+          <w:rFonts w:ascii="Times New Roman" w:hAnsi="Times New Roman"/>
+          <w:szCs w:val="26"/>
+          <w:lang w:val="da-DK"/>
+        </w:rPr>
+        <w:t xml:space="preserve"> và toàn bộ những thiệt hại thực tế làm ảnh hưởng đến chất lượng dịch vụ do Bên B cung cấp.</w:t>
       </w:r>
     </w:p>
     <w:p>
@@ -8257,7 +8396,7 @@
           <w:szCs w:val="26"/>
           <w:lang w:val="da-DK"/>
         </w:rPr>
-        <w:t xml:space="preserve">Các </w:t>
+        <w:t xml:space="preserve"> Các </w:t>
       </w:r>
       <w:r>
         <w:rPr>
@@ -8504,16 +8643,7 @@
           <w:szCs w:val="26"/>
           <w:lang w:val="da-DK"/>
         </w:rPr>
-        <w:t xml:space="preserve">- Hai bên cam kết thực hiện nghiêm chỉnh các điều khoản đã ghi trong hợp đồng </w:t>
-      </w:r>
-      <w:r>
-        <w:rPr>
-          <w:rFonts w:ascii="Times New Roman" w:hAnsi="Times New Roman"/>
-          <w:szCs w:val="26"/>
-          <w:lang w:val="da-DK"/>
-        </w:rPr>
-        <w:lastRenderedPageBreak/>
-        <w:t>này. Trong quá trình thực hiện, nếu có vấn đề gì phát sinh, hai bên sẽ thông báo cho nhau và cùng nhau bàn bạc giải quyết trên cơ sở hợp tình, hợp lý.</w:t>
+        <w:t>- Hai bên cam kết thực hiện nghiêm chỉnh các điều khoản đã ghi trong hợp đồng này. Trong quá trình thực hiện, nếu có vấn đề gì phát sinh, hai bên sẽ thông báo cho nhau và cùng nhau bàn bạc giải quyết trên cơ sở hợp tình, hợp lý.</w:t>
       </w:r>
     </w:p>
     <w:p>
@@ -8534,7 +8664,16 @@
           <w:szCs w:val="26"/>
           <w:lang w:val="da-DK"/>
         </w:rPr>
-        <w:t>- Khi xảy ra bất đồng trong tranh chấp, hai bên cố gắng giải quyết bằng thương lượng. Trong trường hợp không thể giải quyết được thì đưa đến toà án có thẩm quyền theo qui định của pháp luật.</w:t>
+        <w:t xml:space="preserve">- Khi xảy ra bất đồng trong tranh chấp, hai bên cố gắng giải quyết bằng thương lượng. Trong trường hợp không thể giải quyết được thì đưa đến toà án có thẩm quyền </w:t>
+      </w:r>
+      <w:r>
+        <w:rPr>
+          <w:rFonts w:ascii="Times New Roman" w:hAnsi="Times New Roman"/>
+          <w:szCs w:val="26"/>
+          <w:lang w:val="da-DK"/>
+        </w:rPr>
+        <w:lastRenderedPageBreak/>
+        <w:t>theo qui định của pháp luật.</w:t>
       </w:r>
     </w:p>
     <w:p>
@@ -9110,7 +9249,7 @@
 </file>
 
 <file path=word/numbering.xml><?xml version="1.0" encoding="utf-8"?>
-<w:numbering xmlns:wpc="http://schemas.microsoft.com/office/word/2010/wordprocessingCanvas" xmlns:cx="http://schemas.microsoft.com/office/drawing/2014/chartex" xmlns:cx1="http://schemas.microsoft.com/office/drawing/2015/9/8/chartex" xmlns:cx2="http://schemas.microsoft.com/office/drawing/2015/10/21/chartex" xmlns:cx3="http://schemas.microsoft.com/office/drawing/2016/5/9/chartex" xmlns:cx4="http://schemas.microsoft.com/office/drawing/2016/5/10/chartex" xmlns:cx5="http://schemas.microsoft.com/office/drawing/2016/5/11/chartex" xmlns:cx6="http://schemas.microsoft.com/office/drawing/2016/5/12/chartex" xmlns:cx7="http://schemas.microsoft.com/office/drawing/2016/5/13/chartex" xmlns:cx8="http://schemas.microsoft.com/office/drawing/2016/5/14/chartex" xmlns:mc="http://schemas.openxmlformats.org/markup-compatibility/2006" xmlns:aink="http://schemas.microsoft.com/office/drawing/2016/ink" xmlns:am3d="http://schemas.microsoft.com/office/drawing/2017/model3d" xmlns:o="urn:schemas-microsoft-com:office:office" xmlns:oel="http://schemas.microsoft.com/office/2019/extlst" xmlns:r="http://schemas.openxmlformats.org/officeDocument/2006/relationships" xmlns:m="http://schemas.openxmlformats.org/officeDocument/2006/math" xmlns:v="urn:schemas-microsoft-com:vml" xmlns:wp14="http://schemas.microsoft.com/office/word/2010/wordprocessingDrawing" xmlns:wp="http://schemas.openxmlformats.org/drawingml/2006/wordprocessingDrawing" xmlns:w10="urn:schemas-microsoft-com:office:word" xmlns:w="http://schemas.openxmlformats.org/wordprocessingml/2006/main" xmlns:w14="http://schemas.microsoft.com/office/word/2010/wordml" xmlns:w15="http://schemas.microsoft.com/office/word/2012/wordml" xmlns:w16cex="http://schemas.microsoft.com/office/word/2018/wordml/cex" xmlns:w16cid="http://schemas.microsoft.com/office/word/2016/wordml/cid" xmlns:w16="http://schemas.microsoft.com/office/word/2018/wordml" xmlns:w16du="http://schemas.microsoft.com/office/word/2023/wordml/word16du" xmlns:w16sdtdh="http://schemas.microsoft.com/office/word/2020/wordml/sdtdatahash" xmlns:w16sdtfl="http://schemas.microsoft.com/office/word/2024/wordml/sdtformatlock" xmlns:w16se="http://schemas.microsoft.com/office/word/2015/wordml/symex" xmlns:wpg="http://schemas.microsoft.com/office/word/2010/wordprocessingGroup" xmlns:wpi="http://schemas.microsoft.com/office/word/2010/wordprocessingInk" xmlns:wne="http://schemas.microsoft.com/office/word/2006/wordml" xmlns:wps="http://schemas.microsoft.com/office/word/2010/wordprocessingShape" mc:Ignorable="w14 w15 w16se w16cid w16 w16cex w16sdtdh w16sdtfl w16du wp14">
+<w:numbering xmlns:wpc="http://schemas.microsoft.com/office/word/2010/wordprocessingCanvas" xmlns:cx="http://schemas.microsoft.com/office/drawing/2014/chartex" xmlns:cx1="http://schemas.microsoft.com/office/drawing/2015/9/8/chartex" xmlns:cx2="http://schemas.microsoft.com/office/drawing/2015/10/21/chartex" xmlns:cx3="http://schemas.microsoft.com/office/drawing/2016/5/9/chartex" xmlns:cx4="http://schemas.microsoft.com/office/drawing/2016/5/10/chartex" xmlns:cx5="http://schemas.microsoft.com/office/drawing/2016/5/11/chartex" xmlns:cx6="http://schemas.microsoft.com/office/drawing/2016/5/12/chartex" xmlns:cx7="http://schemas.microsoft.com/office/drawing/2016/5/13/chartex" xmlns:cx8="http://schemas.microsoft.com/office/drawing/2016/5/14/chartex" xmlns:mc="http://schemas.openxmlformats.org/markup-compatibility/2006" xmlns:aink="http://schemas.microsoft.com/office/drawing/2016/ink" xmlns:am3d="http://schemas.microsoft.com/office/drawing/2017/model3d" xmlns:o="urn:schemas-microsoft-com:office:office" xmlns:r="http://schemas.openxmlformats.org/officeDocument/2006/relationships" xmlns:m="http://schemas.openxmlformats.org/officeDocument/2006/math" xmlns:v="urn:schemas-microsoft-com:vml" xmlns:wp14="http://schemas.microsoft.com/office/word/2010/wordprocessingDrawing" xmlns:wp="http://schemas.openxmlformats.org/drawingml/2006/wordprocessingDrawing" xmlns:w10="urn:schemas-microsoft-com:office:word" xmlns:w="http://schemas.openxmlformats.org/wordprocessingml/2006/main" xmlns:w14="http://schemas.microsoft.com/office/word/2010/wordml" xmlns:w15="http://schemas.microsoft.com/office/word/2012/wordml" xmlns:w16cid="http://schemas.microsoft.com/office/word/2016/wordml/cid" xmlns:w16se="http://schemas.microsoft.com/office/word/2015/wordml/symex" xmlns:wpg="http://schemas.microsoft.com/office/word/2010/wordprocessingGroup" xmlns:wpi="http://schemas.microsoft.com/office/word/2010/wordprocessingInk" xmlns:wne="http://schemas.microsoft.com/office/word/2006/wordml" xmlns:wps="http://schemas.microsoft.com/office/word/2010/wordprocessingShape" mc:Ignorable="w14 w15 w16se w16cid wp14">
   <w:abstractNum w:abstractNumId="0" w15:restartNumberingAfterBreak="1">
     <w:nsid w:val="084E5937"/>
     <w:multiLevelType w:val="hybridMultilevel"/>
@@ -11229,7 +11368,7 @@
         <w:rFonts w:ascii="Times New Roman" w:eastAsia="Times New Roman" w:hAnsi="Times New Roman" w:cs="Times New Roman" w:hint="default"/>
       </w:rPr>
     </w:lvl>
-    <w:lvl w:ilvl="1" w:tplc="042A0003">
+    <w:lvl w:ilvl="1" w:tplc="042A0003" w:tentative="1">
       <w:start w:val="1"/>
       <w:numFmt w:val="bullet"/>
       <w:lvlText w:val="o"/>
@@ -12193,98 +12332,98 @@
       </w:pPr>
     </w:lvl>
   </w:abstractNum>
-  <w:num w:numId="1" w16cid:durableId="2107068256">
+  <w:num w:numId="1">
     <w:abstractNumId w:val="15"/>
   </w:num>
-  <w:num w:numId="2" w16cid:durableId="51850925">
+  <w:num w:numId="2">
     <w:abstractNumId w:val="13"/>
   </w:num>
-  <w:num w:numId="3" w16cid:durableId="1542209819">
+  <w:num w:numId="3">
     <w:abstractNumId w:val="19"/>
   </w:num>
-  <w:num w:numId="4" w16cid:durableId="201942620">
+  <w:num w:numId="4">
     <w:abstractNumId w:val="22"/>
   </w:num>
-  <w:num w:numId="5" w16cid:durableId="1260481211">
+  <w:num w:numId="5">
     <w:abstractNumId w:val="14"/>
   </w:num>
-  <w:num w:numId="6" w16cid:durableId="939800079">
+  <w:num w:numId="6">
     <w:abstractNumId w:val="27"/>
   </w:num>
-  <w:num w:numId="7" w16cid:durableId="1250962305">
+  <w:num w:numId="7">
     <w:abstractNumId w:val="0"/>
   </w:num>
-  <w:num w:numId="8" w16cid:durableId="103577177">
+  <w:num w:numId="8">
     <w:abstractNumId w:val="7"/>
   </w:num>
-  <w:num w:numId="9" w16cid:durableId="1022904731">
+  <w:num w:numId="9">
     <w:abstractNumId w:val="5"/>
   </w:num>
-  <w:num w:numId="10" w16cid:durableId="1196163119">
+  <w:num w:numId="10">
     <w:abstractNumId w:val="28"/>
   </w:num>
-  <w:num w:numId="11" w16cid:durableId="1543707431">
+  <w:num w:numId="11">
     <w:abstractNumId w:val="24"/>
   </w:num>
-  <w:num w:numId="12" w16cid:durableId="911357681">
+  <w:num w:numId="12">
     <w:abstractNumId w:val="1"/>
   </w:num>
-  <w:num w:numId="13" w16cid:durableId="551229485">
+  <w:num w:numId="13">
     <w:abstractNumId w:val="3"/>
   </w:num>
-  <w:num w:numId="14" w16cid:durableId="1899123451">
+  <w:num w:numId="14">
     <w:abstractNumId w:val="8"/>
   </w:num>
-  <w:num w:numId="15" w16cid:durableId="1412846885">
+  <w:num w:numId="15">
     <w:abstractNumId w:val="10"/>
   </w:num>
-  <w:num w:numId="16" w16cid:durableId="736631601">
+  <w:num w:numId="16">
     <w:abstractNumId w:val="12"/>
   </w:num>
-  <w:num w:numId="17" w16cid:durableId="1274092513">
+  <w:num w:numId="17">
     <w:abstractNumId w:val="6"/>
   </w:num>
-  <w:num w:numId="18" w16cid:durableId="428547124">
+  <w:num w:numId="18">
     <w:abstractNumId w:val="18"/>
   </w:num>
-  <w:num w:numId="19" w16cid:durableId="1822455192">
+  <w:num w:numId="19">
     <w:abstractNumId w:val="21"/>
   </w:num>
-  <w:num w:numId="20" w16cid:durableId="208228178">
+  <w:num w:numId="20">
     <w:abstractNumId w:val="26"/>
   </w:num>
-  <w:num w:numId="21" w16cid:durableId="32771855">
+  <w:num w:numId="21">
     <w:abstractNumId w:val="16"/>
   </w:num>
-  <w:num w:numId="22" w16cid:durableId="2104838644">
+  <w:num w:numId="22">
     <w:abstractNumId w:val="25"/>
   </w:num>
-  <w:num w:numId="23" w16cid:durableId="48385446">
+  <w:num w:numId="23">
     <w:abstractNumId w:val="23"/>
   </w:num>
-  <w:num w:numId="24" w16cid:durableId="1673021271">
+  <w:num w:numId="24">
     <w:abstractNumId w:val="11"/>
   </w:num>
-  <w:num w:numId="25" w16cid:durableId="1793093438">
+  <w:num w:numId="25">
     <w:abstractNumId w:val="17"/>
   </w:num>
-  <w:num w:numId="26" w16cid:durableId="612521167">
+  <w:num w:numId="26">
     <w:abstractNumId w:val="20"/>
   </w:num>
-  <w:num w:numId="27" w16cid:durableId="233592720">
+  <w:num w:numId="27">
     <w:abstractNumId w:val="2"/>
   </w:num>
-  <w:num w:numId="28" w16cid:durableId="8262222">
+  <w:num w:numId="28">
     <w:abstractNumId w:val="9"/>
   </w:num>
-  <w:num w:numId="29" w16cid:durableId="237060495">
+  <w:num w:numId="29">
     <w:abstractNumId w:val="4"/>
   </w:num>
 </w:numbering>
 </file>
 
 <file path=word/styles.xml><?xml version="1.0" encoding="utf-8"?>
-<w:styles xmlns:mc="http://schemas.openxmlformats.org/markup-compatibility/2006" xmlns:r="http://schemas.openxmlformats.org/officeDocument/2006/relationships" xmlns:w="http://schemas.openxmlformats.org/wordprocessingml/2006/main" xmlns:w14="http://schemas.microsoft.com/office/word/2010/wordml" xmlns:w15="http://schemas.microsoft.com/office/word/2012/wordml" xmlns:w16cex="http://schemas.microsoft.com/office/word/2018/wordml/cex" xmlns:w16cid="http://schemas.microsoft.com/office/word/2016/wordml/cid" xmlns:w16="http://schemas.microsoft.com/office/word/2018/wordml" xmlns:w16du="http://schemas.microsoft.com/office/word/2023/wordml/word16du" xmlns:w16sdtdh="http://schemas.microsoft.com/office/word/2020/wordml/sdtdatahash" xmlns:w16sdtfl="http://schemas.microsoft.com/office/word/2024/wordml/sdtformatlock" xmlns:w16se="http://schemas.microsoft.com/office/word/2015/wordml/symex" mc:Ignorable="w14 w15 w16se w16cid w16 w16cex w16sdtdh w16sdtfl w16du">
+<w:styles xmlns:mc="http://schemas.openxmlformats.org/markup-compatibility/2006" xmlns:r="http://schemas.openxmlformats.org/officeDocument/2006/relationships" xmlns:w="http://schemas.openxmlformats.org/wordprocessingml/2006/main" xmlns:w14="http://schemas.microsoft.com/office/word/2010/wordml" xmlns:w15="http://schemas.microsoft.com/office/word/2012/wordml" xmlns:w16cid="http://schemas.microsoft.com/office/word/2016/wordml/cid" xmlns:w16se="http://schemas.microsoft.com/office/word/2015/wordml/symex" mc:Ignorable="w14 w15 w16se w16cid">
   <w:docDefaults>
     <w:rPrDefault>
       <w:rPr>
@@ -12302,7 +12441,7 @@
       </w:pPr>
     </w:pPrDefault>
   </w:docDefaults>
-  <w:latentStyles w:defLockedState="0" w:defUIPriority="99" w:defSemiHidden="0" w:defUnhideWhenUsed="0" w:defQFormat="0" w:count="376">
+  <w:latentStyles w:defLockedState="0" w:defUIPriority="99" w:defSemiHidden="0" w:defUnhideWhenUsed="0" w:defQFormat="0" w:count="375">
     <w:lsdException w:name="Normal" w:uiPriority="0" w:qFormat="1"/>
     <w:lsdException w:name="heading 1" w:uiPriority="9" w:qFormat="1"/>
     <w:lsdException w:name="heading 2" w:semiHidden="1" w:uiPriority="9" w:unhideWhenUsed="1" w:qFormat="1"/>
@@ -12678,12 +12817,11 @@
     <w:lsdException w:name="Smart Hyperlink" w:semiHidden="1" w:unhideWhenUsed="1"/>
     <w:lsdException w:name="Hashtag" w:semiHidden="1" w:unhideWhenUsed="1"/>
     <w:lsdException w:name="Unresolved Mention" w:semiHidden="1" w:unhideWhenUsed="1"/>
-    <w:lsdException w:name="Smart Link" w:semiHidden="1" w:unhideWhenUsed="1"/>
   </w:latentStyles>
   <w:style w:type="paragraph" w:default="1" w:styleId="Normal">
     <w:name w:val="Normal"/>
     <w:qFormat/>
-    <w:rsid w:val="00E51D78"/>
+    <w:rsid w:val="00464D70"/>
     <w:pPr>
       <w:spacing w:after="0" w:line="240" w:lineRule="auto"/>
     </w:pPr>
@@ -13296,7 +13434,7 @@
     <w:name w:val="Body Text"/>
     <w:basedOn w:val="Normal"/>
     <w:link w:val="BodyTextChar"/>
-    <w:rsid w:val="00E51D78"/>
+    <w:rsid w:val="008865A9"/>
     <w:pPr>
       <w:jc w:val="both"/>
     </w:pPr>
@@ -13305,7 +13443,7 @@
     <w:name w:val="Body Text Char"/>
     <w:basedOn w:val="DefaultParagraphFont"/>
     <w:link w:val="BodyText"/>
-    <w:rsid w:val="00E51D78"/>
+    <w:rsid w:val="008865A9"/>
     <w:rPr>
       <w:rFonts w:ascii="VNI-Times" w:eastAsia="Times New Roman" w:hAnsi="VNI-Times" w:cs="Times New Roman"/>
       <w:kern w:val="0"/>
@@ -13319,7 +13457,7 @@
     <w:name w:val="Body Text Indent 3"/>
     <w:basedOn w:val="Normal"/>
     <w:link w:val="BodyTextIndent3Char"/>
-    <w:rsid w:val="00E51D78"/>
+    <w:rsid w:val="008865A9"/>
     <w:pPr>
       <w:tabs>
         <w:tab w:val="left" w:pos="180"/>
@@ -13338,7 +13476,7 @@
     <w:name w:val="Body Text Indent 3 Char"/>
     <w:basedOn w:val="DefaultParagraphFont"/>
     <w:link w:val="BodyTextIndent3"/>
-    <w:rsid w:val="00E51D78"/>
+    <w:rsid w:val="008865A9"/>
     <w:rPr>
       <w:rFonts w:ascii="VNI-Times" w:eastAsia="Times New Roman" w:hAnsi="VNI-Times" w:cs="Times New Roman"/>
       <w:kern w:val="0"/>

</xml_diff>